<commit_message>
Se arregla documento de requisitos
Se corrige el documento de requisitos en base a una revisión de requisitos
</commit_message>
<xml_diff>
--- a/Fase 2/Evidencias Proyecto/3.- Fase de analisis/1. Documento de requisitos.docx
+++ b/Fase 2/Evidencias Proyecto/3.- Fase de analisis/1. Documento de requisitos.docx
@@ -83,6 +83,7 @@
               <w:spacing w:after="60" w:before="60" w:lineRule="auto"/>
               <w:rPr>
                 <w:b w:val="1"/>
+                <w:bCs w:val="1"/>
                 <w:color w:val="000000"/>
                 <w:sz w:val="26"/>
                 <w:szCs w:val="26"/>
@@ -93,6 +94,7 @@
             <w:r>
               <w:rPr>
                 <w:b w:val="1"/>
+                <w:bCs w:val="1"/>
                 <w:color w:val="000000"/>
                 <w:sz w:val="26"/>
                 <w:szCs w:val="26"/>
@@ -135,14 +137,16 @@
               <w:spacing w:after="60" w:before="60" w:lineRule="auto"/>
               <w:rPr>
                 <w:b w:val="1"/>
-                <w:color w:val="000000"/>
-                <w:sz w:val="18"/>
-                <w:szCs w:val="18"/>
-              </w:rPr>
-            </w:pPr>
-            <w:r>
-              <w:rPr>
-                <w:b w:val="1"/>
+                <w:bCs w:val="1"/>
+                <w:color w:val="000000"/>
+                <w:sz w:val="18"/>
+                <w:szCs w:val="18"/>
+              </w:rPr>
+            </w:pPr>
+            <w:r>
+              <w:rPr>
+                <w:b w:val="1"/>
+                <w:bCs w:val="1"/>
                 <w:color w:val="ff0000"/>
                 <w:sz w:val="18"/>
                 <w:szCs w:val="18"/>
@@ -162,6 +166,7 @@
             <w:r>
               <w:rPr>
                 <w:b w:val="1"/>
+                <w:bCs w:val="1"/>
                 <w:color w:val="000000"/>
                 <w:sz w:val="18"/>
                 <w:szCs w:val="18"/>
@@ -243,14 +248,16 @@
               <w:spacing w:after="60" w:before="60" w:lineRule="auto"/>
               <w:rPr>
                 <w:b w:val="1"/>
-                <w:color w:val="000000"/>
-                <w:sz w:val="18"/>
-                <w:szCs w:val="18"/>
-              </w:rPr>
-            </w:pPr>
-            <w:r>
-              <w:rPr>
-                <w:b w:val="1"/>
+                <w:bCs w:val="1"/>
+                <w:color w:val="000000"/>
+                <w:sz w:val="18"/>
+                <w:szCs w:val="18"/>
+              </w:rPr>
+            </w:pPr>
+            <w:r>
+              <w:rPr>
+                <w:b w:val="1"/>
+                <w:bCs w:val="1"/>
                 <w:color w:val="ff0000"/>
                 <w:sz w:val="18"/>
                 <w:szCs w:val="18"/>
@@ -261,6 +268,7 @@
             <w:r>
               <w:rPr>
                 <w:b w:val="1"/>
+                <w:bCs w:val="1"/>
                 <w:color w:val="000000"/>
                 <w:sz w:val="18"/>
                 <w:szCs w:val="18"/>
@@ -306,7 +314,7 @@
                 <w:szCs w:val="18"/>
                 <w:rtl w:val="0"/>
               </w:rPr>
-              <w:t xml:space="preserve">27/08/2024</w:t>
+              <w:t xml:space="preserve">28/05/2026</w:t>
             </w:r>
             <w:r>
               <w:rPr>
@@ -345,14 +353,16 @@
               <w:spacing w:after="60" w:before="60" w:lineRule="auto"/>
               <w:rPr>
                 <w:b w:val="1"/>
-                <w:color w:val="000000"/>
-                <w:sz w:val="18"/>
-                <w:szCs w:val="18"/>
-              </w:rPr>
-            </w:pPr>
-            <w:r>
-              <w:rPr>
-                <w:b w:val="1"/>
+                <w:bCs w:val="1"/>
+                <w:color w:val="000000"/>
+                <w:sz w:val="18"/>
+                <w:szCs w:val="18"/>
+              </w:rPr>
+            </w:pPr>
+            <w:r>
+              <w:rPr>
+                <w:b w:val="1"/>
+                <w:bCs w:val="1"/>
                 <w:color w:val="ff0000"/>
                 <w:sz w:val="18"/>
                 <w:szCs w:val="18"/>
@@ -372,6 +382,7 @@
             <w:r>
               <w:rPr>
                 <w:b w:val="1"/>
+                <w:bCs w:val="1"/>
                 <w:color w:val="000000"/>
                 <w:sz w:val="18"/>
                 <w:szCs w:val="18"/>
@@ -415,7 +426,7 @@
                 <w:szCs w:val="18"/>
                 <w:rtl w:val="0"/>
               </w:rPr>
-              <w:t xml:space="preserve">BLAZE</w:t>
+              <w:t xml:space="preserve">SIDEP</w:t>
             </w:r>
             <w:r>
               <w:rPr>
@@ -457,14 +468,16 @@
               <w:spacing w:after="60" w:before="60" w:lineRule="auto"/>
               <w:rPr>
                 <w:b w:val="1"/>
-                <w:color w:val="000000"/>
-                <w:sz w:val="18"/>
-                <w:szCs w:val="18"/>
-              </w:rPr>
-            </w:pPr>
-            <w:r>
-              <w:rPr>
-                <w:b w:val="1"/>
+                <w:bCs w:val="1"/>
+                <w:color w:val="000000"/>
+                <w:sz w:val="18"/>
+                <w:szCs w:val="18"/>
+              </w:rPr>
+            </w:pPr>
+            <w:r>
+              <w:rPr>
+                <w:b w:val="1"/>
+                <w:bCs w:val="1"/>
                 <w:color w:val="ff0000"/>
                 <w:sz w:val="18"/>
                 <w:szCs w:val="18"/>
@@ -484,6 +497,7 @@
             <w:r>
               <w:rPr>
                 <w:b w:val="1"/>
+                <w:bCs w:val="1"/>
                 <w:color w:val="000000"/>
                 <w:sz w:val="18"/>
                 <w:szCs w:val="18"/>
@@ -530,7 +544,7 @@
                 <w:szCs w:val="18"/>
                 <w:rtl w:val="0"/>
               </w:rPr>
-              <w:t xml:space="preserve">Fabian Olate</w:t>
+              <w:t xml:space="preserve">Ignacio Pinares</w:t>
             </w:r>
             <w:r>
               <w:rPr>
@@ -572,14 +586,16 @@
               <w:spacing w:after="60" w:before="60" w:lineRule="auto"/>
               <w:rPr>
                 <w:b w:val="1"/>
-                <w:color w:val="000000"/>
-                <w:sz w:val="18"/>
-                <w:szCs w:val="18"/>
-              </w:rPr>
-            </w:pPr>
-            <w:r>
-              <w:rPr>
-                <w:b w:val="1"/>
+                <w:bCs w:val="1"/>
+                <w:color w:val="000000"/>
+                <w:sz w:val="18"/>
+                <w:szCs w:val="18"/>
+              </w:rPr>
+            </w:pPr>
+            <w:r>
+              <w:rPr>
+                <w:b w:val="1"/>
+                <w:bCs w:val="1"/>
                 <w:color w:val="ff0000"/>
                 <w:sz w:val="18"/>
                 <w:szCs w:val="18"/>
@@ -599,6 +615,7 @@
             <w:r>
               <w:rPr>
                 <w:b w:val="1"/>
+                <w:bCs w:val="1"/>
                 <w:color w:val="000000"/>
                 <w:sz w:val="18"/>
                 <w:szCs w:val="18"/>
@@ -760,6 +777,7 @@
               <w:spacing w:after="60" w:before="60" w:lineRule="auto"/>
               <w:rPr>
                 <w:b w:val="1"/>
+                <w:bCs w:val="1"/>
                 <w:color w:val="000000"/>
                 <w:sz w:val="26"/>
                 <w:szCs w:val="26"/>
@@ -768,6 +786,7 @@
             <w:r>
               <w:rPr>
                 <w:b w:val="1"/>
+                <w:bCs w:val="1"/>
                 <w:sz w:val="26"/>
                 <w:szCs w:val="26"/>
                 <w:rtl w:val="0"/>
@@ -815,6 +834,7 @@
               <w:jc w:val="both"/>
               <w:rPr>
                 <w:b w:val="1"/>
+                <w:bCs w:val="1"/>
                 <w:color w:val="000000"/>
                 <w:sz w:val="18"/>
                 <w:szCs w:val="18"/>
@@ -869,37 +889,58 @@
                 <w:tab w:val="center" w:leader="none" w:pos="4320"/>
                 <w:tab w:val="right" w:leader="none" w:pos="8640"/>
               </w:tabs>
-              <w:spacing w:after="240" w:before="0" w:lineRule="auto"/>
-              <w:ind w:left="0" w:firstLine="0"/>
-              <w:rPr>
-                <w:sz w:val="18"/>
-                <w:szCs w:val="18"/>
-              </w:rPr>
-            </w:pPr>
-            <w:r>
-              <w:rPr>
-                <w:sz w:val="18"/>
-                <w:szCs w:val="18"/>
-                <w:rtl w:val="0"/>
-              </w:rPr>
-              <w:t xml:space="preserve">Este documento detalla los requisitos para el desarrollo de la aplicación web </w:t>
-            </w:r>
-            <w:r>
-              <w:rPr>
-                <w:b w:val="1"/>
-                <w:sz w:val="18"/>
-                <w:szCs w:val="18"/>
-                <w:rtl w:val="0"/>
-              </w:rPr>
-              <w:t xml:space="preserve">Blaze</w:t>
-            </w:r>
-            <w:r>
-              <w:rPr>
-                <w:sz w:val="18"/>
-                <w:szCs w:val="18"/>
-                <w:rtl w:val="0"/>
-              </w:rPr>
-              <w:t xml:space="preserve">, un sistema de gestión para talleres automotrices. El objetivo del sistema es optimizar las actividades diarias del taller, incluyendo la administración de órdenes de trabajo, la reserva de citas en línea, la comunicación con clientes y el seguimiento de reparaciones.</w:t>
+              <w:spacing w:after="240" w:before="240" w:lineRule="auto"/>
+              <w:rPr>
+                <w:sz w:val="18"/>
+                <w:szCs w:val="18"/>
+              </w:rPr>
+            </w:pPr>
+            <w:r>
+              <w:rPr>
+                <w:sz w:val="18"/>
+                <w:szCs w:val="18"/>
+                <w:rtl w:val="0"/>
+              </w:rPr>
+              <w:t xml:space="preserve">Este documento describe los requisitos del sistema </w:t>
+            </w:r>
+            <w:r>
+              <w:rPr>
+                <w:b w:val="1"/>
+                <w:bCs w:val="1"/>
+                <w:sz w:val="18"/>
+                <w:szCs w:val="18"/>
+                <w:rtl w:val="0"/>
+              </w:rPr>
+              <w:t xml:space="preserve">SIDEP</w:t>
+            </w:r>
+            <w:r>
+              <w:rPr>
+                <w:sz w:val="18"/>
+                <w:szCs w:val="18"/>
+                <w:rtl w:val="0"/>
+              </w:rPr>
+              <w:t xml:space="preserve">, una aplicación web orientada a la gestión de emergencias, operaciones internas, logística, recursos humanos y auditoría.</w:t>
+            </w:r>
+          </w:p>
+          <w:p>
+            <w:pPr>
+              <w:tabs>
+                <w:tab w:val="center" w:leader="none" w:pos="4320"/>
+                <w:tab w:val="right" w:leader="none" w:pos="8640"/>
+              </w:tabs>
+              <w:spacing w:after="240" w:before="240" w:lineRule="auto"/>
+              <w:rPr>
+                <w:sz w:val="18"/>
+                <w:szCs w:val="18"/>
+              </w:rPr>
+            </w:pPr>
+            <w:r>
+              <w:rPr>
+                <w:sz w:val="18"/>
+                <w:szCs w:val="18"/>
+                <w:rtl w:val="0"/>
+              </w:rPr>
+              <w:t xml:space="preserve">El sistema busca optimizar el registro, seguimiento y control de eventos de emergencia, así como la gestión del personal y recursos involucrados.</w:t>
             </w:r>
           </w:p>
           <w:p>
@@ -956,6 +997,7 @@
               <w:jc w:val="both"/>
               <w:rPr>
                 <w:b w:val="1"/>
+                <w:bCs w:val="1"/>
                 <w:sz w:val="18"/>
                 <w:szCs w:val="18"/>
               </w:rPr>
@@ -997,25 +1039,6 @@
                 <w:tab w:val="center" w:leader="none" w:pos="4320"/>
                 <w:tab w:val="right" w:leader="none" w:pos="8640"/>
               </w:tabs>
-              <w:spacing w:after="60" w:lineRule="auto"/>
-              <w:ind w:left="0" w:firstLine="0"/>
-              <w:rPr>
-                <w:sz w:val="18"/>
-                <w:szCs w:val="18"/>
-              </w:rPr>
-            </w:pPr>
-            <w:r>
-              <w:rPr>
-                <w:rtl w:val="0"/>
-              </w:rPr>
-            </w:r>
-          </w:p>
-          <w:p>
-            <w:pPr>
-              <w:tabs>
-                <w:tab w:val="center" w:leader="none" w:pos="4320"/>
-                <w:tab w:val="right" w:leader="none" w:pos="8640"/>
-              </w:tabs>
               <w:spacing w:after="240" w:before="240" w:lineRule="auto"/>
               <w:rPr>
                 <w:sz w:val="18"/>
@@ -1028,14 +1051,14 @@
                 <w:szCs w:val="18"/>
                 <w:rtl w:val="0"/>
               </w:rPr>
-              <w:t xml:space="preserve">El sistema cubrirá las siguientes áreas funcionales:</w:t>
+              <w:t xml:space="preserve">El sistema cubrirá las siguientes áreas:</w:t>
             </w:r>
           </w:p>
           <w:p>
             <w:pPr>
               <w:numPr>
                 <w:ilvl w:val="0"/>
-                <w:numId w:val="10"/>
+                <w:numId w:val="1"/>
               </w:numPr>
               <w:tabs>
                 <w:tab w:val="center" w:leader="none" w:pos="4320"/>
@@ -1054,14 +1077,14 @@
                 <w:szCs w:val="18"/>
                 <w:rtl w:val="0"/>
               </w:rPr>
-              <w:t xml:space="preserve">Registro de vehículos</w:t>
+              <w:t xml:space="preserve">Gestión de usuarios y autenticación</w:t>
             </w:r>
           </w:p>
           <w:p>
             <w:pPr>
               <w:numPr>
                 <w:ilvl w:val="0"/>
-                <w:numId w:val="10"/>
+                <w:numId w:val="1"/>
               </w:numPr>
               <w:tabs>
                 <w:tab w:val="center" w:leader="none" w:pos="4320"/>
@@ -1080,14 +1103,14 @@
                 <w:szCs w:val="18"/>
                 <w:rtl w:val="0"/>
               </w:rPr>
-              <w:t xml:space="preserve">Gestión de órdenes de trabajo</w:t>
+              <w:t xml:space="preserve">Registro y seguimiento de emergencias</w:t>
             </w:r>
           </w:p>
           <w:p>
             <w:pPr>
               <w:numPr>
                 <w:ilvl w:val="0"/>
-                <w:numId w:val="10"/>
+                <w:numId w:val="1"/>
               </w:numPr>
               <w:tabs>
                 <w:tab w:val="center" w:leader="none" w:pos="4320"/>
@@ -1106,14 +1129,14 @@
                 <w:szCs w:val="18"/>
                 <w:rtl w:val="0"/>
               </w:rPr>
-              <w:t xml:space="preserve">Reserva de citas en línea</w:t>
+              <w:t xml:space="preserve">Control logístico de recursos</w:t>
             </w:r>
           </w:p>
           <w:p>
             <w:pPr>
               <w:numPr>
                 <w:ilvl w:val="0"/>
-                <w:numId w:val="10"/>
+                <w:numId w:val="1"/>
               </w:numPr>
               <w:tabs>
                 <w:tab w:val="center" w:leader="none" w:pos="4320"/>
@@ -1132,14 +1155,40 @@
                 <w:szCs w:val="18"/>
                 <w:rtl w:val="0"/>
               </w:rPr>
-              <w:t xml:space="preserve">Comunicación entre el taller y los clientes(Notificaciones)</w:t>
+              <w:t xml:space="preserve">Gestión de licencias médicas</w:t>
             </w:r>
           </w:p>
           <w:p>
             <w:pPr>
               <w:numPr>
                 <w:ilvl w:val="0"/>
-                <w:numId w:val="10"/>
+                <w:numId w:val="1"/>
+              </w:numPr>
+              <w:tabs>
+                <w:tab w:val="center" w:leader="none" w:pos="4320"/>
+                <w:tab w:val="right" w:leader="none" w:pos="8640"/>
+              </w:tabs>
+              <w:spacing w:after="0" w:afterAutospacing="0" w:before="0" w:beforeAutospacing="0" w:lineRule="auto"/>
+              <w:ind w:left="720" w:hanging="360"/>
+              <w:rPr>
+                <w:sz w:val="18"/>
+                <w:szCs w:val="18"/>
+              </w:rPr>
+            </w:pPr>
+            <w:r>
+              <w:rPr>
+                <w:sz w:val="18"/>
+                <w:szCs w:val="18"/>
+                <w:rtl w:val="0"/>
+              </w:rPr>
+              <w:t xml:space="preserve">Visualización analítica (dashboard)</w:t>
+            </w:r>
+          </w:p>
+          <w:p>
+            <w:pPr>
+              <w:numPr>
+                <w:ilvl w:val="0"/>
+                <w:numId w:val="1"/>
               </w:numPr>
               <w:tabs>
                 <w:tab w:val="center" w:leader="none" w:pos="4320"/>
@@ -1150,34 +1199,15 @@
               <w:rPr>
                 <w:sz w:val="18"/>
                 <w:szCs w:val="18"/>
-                <w:u w:val="none"/>
-              </w:rPr>
-            </w:pPr>
-            <w:r>
-              <w:rPr>
-                <w:sz w:val="18"/>
-                <w:szCs w:val="18"/>
-                <w:rtl w:val="0"/>
-              </w:rPr>
-              <w:t xml:space="preserve">Pago de los servicios efectuados en línea</w:t>
-            </w:r>
-          </w:p>
-          <w:p>
-            <w:pPr>
-              <w:tabs>
-                <w:tab w:val="center" w:leader="none" w:pos="4320"/>
-                <w:tab w:val="right" w:leader="none" w:pos="8640"/>
-              </w:tabs>
-              <w:spacing w:after="60" w:before="0" w:lineRule="auto"/>
-              <w:rPr>
-                <w:sz w:val="18"/>
-                <w:szCs w:val="18"/>
-              </w:rPr>
-            </w:pPr>
-            <w:r>
-              <w:rPr>
-                <w:rtl w:val="0"/>
-              </w:rPr>
+              </w:rPr>
+            </w:pPr>
+            <w:r>
+              <w:rPr>
+                <w:sz w:val="18"/>
+                <w:szCs w:val="18"/>
+                <w:rtl w:val="0"/>
+              </w:rPr>
+              <w:t xml:space="preserve">Auditoría de acciones del sistema</w:t>
             </w:r>
           </w:p>
         </w:tc>
@@ -1294,6 +1324,7 @@
               <w:jc w:val="both"/>
               <w:rPr>
                 <w:b w:val="1"/>
+                <w:bCs w:val="1"/>
                 <w:sz w:val="18"/>
                 <w:szCs w:val="18"/>
               </w:rPr>
@@ -1349,59 +1380,77 @@
           </w:p>
           <w:p>
             <w:pPr>
-              <w:pStyle w:val="Heading4"/>
+              <w:pStyle w:val="Heading3"/>
               <w:keepNext w:val="0"/>
-              <w:tabs>
-                <w:tab w:val="center" w:leader="none" w:pos="4320"/>
-                <w:tab w:val="right" w:leader="none" w:pos="8640"/>
-              </w:tabs>
-              <w:spacing w:after="40" w:before="240" w:lineRule="auto"/>
-              <w:ind w:left="720" w:hanging="360"/>
-              <w:rPr>
-                <w:i w:val="0"/>
-              </w:rPr>
-            </w:pPr>
-            <w:bookmarkStart w:colFirst="0" w:colLast="0" w:name="_heading=h.1xyvgvexec7n" w:id="1"/>
-            <w:bookmarkEnd w:id="1"/>
-            <w:r>
-              <w:rPr>
-                <w:i w:val="0"/>
-                <w:rtl w:val="0"/>
-              </w:rPr>
-              <w:t xml:space="preserve">1. Módulo de Registro de Vehículos</w:t>
-            </w:r>
-          </w:p>
-          <w:p>
-            <w:pPr>
               <w:numPr>
                 <w:ilvl w:val="0"/>
-                <w:numId w:val="3"/>
+                <w:numId w:val="12"/>
               </w:numPr>
               <w:tabs>
                 <w:tab w:val="center" w:leader="none" w:pos="4320"/>
                 <w:tab w:val="right" w:leader="none" w:pos="8640"/>
               </w:tabs>
-              <w:spacing w:after="0" w:afterAutospacing="0" w:before="240" w:lineRule="auto"/>
+              <w:spacing w:after="0" w:afterAutospacing="0" w:before="280" w:lineRule="auto"/>
               <w:ind w:left="720" w:hanging="360"/>
               <w:rPr>
-                <w:sz w:val="18"/>
-                <w:szCs w:val="18"/>
-              </w:rPr>
-            </w:pPr>
-            <w:r>
-              <w:rPr>
-                <w:sz w:val="18"/>
-                <w:szCs w:val="18"/>
-                <w:rtl w:val="0"/>
-              </w:rPr>
-              <w:t xml:space="preserve">RF01: El sistema debe permitir el registro de nuevos vehículos ingresando datos como marca, modelo, año y patente.</w:t>
+                <w:b w:val="0"/>
+                <w:bCs w:val="0"/>
+                <w:color w:val="000000"/>
+                <w:sz w:val="18"/>
+                <w:szCs w:val="18"/>
+              </w:rPr>
+            </w:pPr>
+            <w:bookmarkStart w:colFirst="0" w:colLast="0" w:name="_heading=h.hktqum7m605d" w:id="1"/>
+            <w:bookmarkEnd w:id="1"/>
+            <w:r>
+              <w:rPr>
+                <w:b w:val="0"/>
+                <w:bCs w:val="0"/>
+                <w:color w:val="000000"/>
+                <w:sz w:val="18"/>
+                <w:szCs w:val="18"/>
+                <w:rtl w:val="0"/>
+              </w:rPr>
+              <w:t xml:space="preserve">Módulo de Autenticación:</w:t>
+              <w:br w:type="textWrapping"/>
+            </w:r>
+            <w:r>
+              <w:rPr>
+                <w:rtl w:val="0"/>
+              </w:rPr>
             </w:r>
           </w:p>
           <w:p>
             <w:pPr>
               <w:numPr>
                 <w:ilvl w:val="0"/>
-                <w:numId w:val="3"/>
+                <w:numId w:val="11"/>
+              </w:numPr>
+              <w:tabs>
+                <w:tab w:val="center" w:leader="none" w:pos="4320"/>
+                <w:tab w:val="right" w:leader="none" w:pos="8640"/>
+              </w:tabs>
+              <w:spacing w:after="0" w:afterAutospacing="0" w:before="0" w:beforeAutospacing="0" w:lineRule="auto"/>
+              <w:ind w:left="720" w:hanging="360"/>
+              <w:rPr>
+                <w:sz w:val="18"/>
+                <w:szCs w:val="18"/>
+              </w:rPr>
+            </w:pPr>
+            <w:r>
+              <w:rPr>
+                <w:sz w:val="18"/>
+                <w:szCs w:val="18"/>
+                <w:rtl w:val="0"/>
+              </w:rPr>
+              <w:t xml:space="preserve">RF01: El sistema debe permitir iniciar sesión a los usuarios.</w:t>
+            </w:r>
+          </w:p>
+          <w:p>
+            <w:pPr>
+              <w:numPr>
+                <w:ilvl w:val="0"/>
+                <w:numId w:val="11"/>
               </w:numPr>
               <w:tabs>
                 <w:tab w:val="center" w:leader="none" w:pos="4320"/>
@@ -1420,31 +1469,588 @@
                 <w:szCs w:val="18"/>
                 <w:rtl w:val="0"/>
               </w:rPr>
-              <w:t xml:space="preserve">RF02: El sistema debe permitir asociar un vehículo a un cliente registrado.</w:t>
-            </w:r>
-          </w:p>
-          <w:p>
-            <w:pPr>
-              <w:pStyle w:val="Heading4"/>
+              <w:t xml:space="preserve">RF02: El sistema debe permitir recuperar o actualizar la contraseña.</w:t>
+            </w:r>
+          </w:p>
+          <w:p>
+            <w:pPr>
               <w:keepNext w:val="0"/>
-              <w:tabs>
-                <w:tab w:val="center" w:leader="none" w:pos="4320"/>
-                <w:tab w:val="right" w:leader="none" w:pos="8640"/>
-              </w:tabs>
-              <w:spacing w:after="40" w:before="240" w:lineRule="auto"/>
-              <w:ind w:left="720" w:hanging="360"/>
-              <w:rPr>
+              <w:keepLines w:val="0"/>
+              <w:pageBreakBefore w:val="0"/>
+              <w:widowControl w:val="1"/>
+              <w:pBdr>
+                <w:top w:space="0" w:sz="0" w:val="nil"/>
+                <w:left w:space="0" w:sz="0" w:val="nil"/>
+                <w:bottom w:space="0" w:sz="0" w:val="nil"/>
+                <w:right w:space="0" w:sz="0" w:val="nil"/>
+                <w:between w:space="0" w:sz="0" w:val="nil"/>
+              </w:pBdr>
+              <w:shd w:fill="auto" w:val="clear"/>
+              <w:tabs>
+                <w:tab w:val="center" w:leader="none" w:pos="4320"/>
+                <w:tab w:val="right" w:leader="none" w:pos="8640"/>
+              </w:tabs>
+              <w:spacing w:after="40" w:before="240" w:line="240" w:lineRule="auto"/>
+              <w:ind w:left="720" w:right="0" w:hanging="360"/>
+              <w:jc w:val="left"/>
+              <w:rPr>
+                <w:rFonts w:ascii="Arial" w:cs="Arial" w:eastAsia="Arial" w:hAnsi="Arial"/>
+                <w:b w:val="0"/>
+                <w:bCs w:val="0"/>
                 <w:i w:val="0"/>
+                <w:iCs w:val="0"/>
+                <w:smallCaps w:val="0"/>
+                <w:strike w:val="0"/>
+                <w:color w:val="000000"/>
+                <w:sz w:val="18"/>
+                <w:szCs w:val="18"/>
+                <w:u w:val="none"/>
+                <w:shd w:fill="auto" w:val="clear"/>
+                <w:vertAlign w:val="baseline"/>
               </w:rPr>
             </w:pPr>
             <w:bookmarkStart w:colFirst="0" w:colLast="0" w:name="_heading=h.j4xshonefbyy" w:id="2"/>
             <w:bookmarkEnd w:id="2"/>
             <w:r>
               <w:rPr>
+                <w:rFonts w:ascii="Arial" w:cs="Arial" w:eastAsia="Arial" w:hAnsi="Arial"/>
+                <w:b w:val="0"/>
+                <w:bCs w:val="0"/>
                 <w:i w:val="0"/>
-                <w:rtl w:val="0"/>
-              </w:rPr>
-              <w:t xml:space="preserve">2. Módulo de Gestión de Órdenes de Trabajo</w:t>
+                <w:iCs w:val="0"/>
+                <w:smallCaps w:val="0"/>
+                <w:strike w:val="0"/>
+                <w:color w:val="000000"/>
+                <w:sz w:val="18"/>
+                <w:szCs w:val="18"/>
+                <w:u w:val="none"/>
+                <w:shd w:fill="auto" w:val="clear"/>
+                <w:vertAlign w:val="baseline"/>
+                <w:rtl w:val="0"/>
+              </w:rPr>
+              <w:t xml:space="preserve">2. </w:t>
+            </w:r>
+            <w:r>
+              <w:rPr>
+                <w:sz w:val="18"/>
+                <w:szCs w:val="18"/>
+                <w:rtl w:val="0"/>
+              </w:rPr>
+              <w:t xml:space="preserve">Módulo de Operaciones </w:t>
+            </w:r>
+            <w:r>
+              <w:rPr>
+                <w:rtl w:val="0"/>
+              </w:rPr>
+            </w:r>
+          </w:p>
+          <w:p>
+            <w:pPr>
+              <w:numPr>
+                <w:ilvl w:val="0"/>
+                <w:numId w:val="5"/>
+              </w:numPr>
+              <w:tabs>
+                <w:tab w:val="center" w:leader="none" w:pos="4320"/>
+                <w:tab w:val="right" w:leader="none" w:pos="8640"/>
+              </w:tabs>
+              <w:spacing w:after="0" w:before="240" w:lineRule="auto"/>
+              <w:ind w:left="720" w:hanging="360"/>
+              <w:rPr>
+                <w:sz w:val="18"/>
+                <w:szCs w:val="18"/>
+              </w:rPr>
+            </w:pPr>
+            <w:r>
+              <w:rPr>
+                <w:b w:val="1"/>
+                <w:bCs w:val="1"/>
+                <w:sz w:val="18"/>
+                <w:szCs w:val="18"/>
+                <w:rtl w:val="0"/>
+              </w:rPr>
+              <w:t xml:space="preserve">RF03:</w:t>
+            </w:r>
+            <w:r>
+              <w:rPr>
+                <w:sz w:val="18"/>
+                <w:szCs w:val="18"/>
+                <w:rtl w:val="0"/>
+              </w:rPr>
+              <w:t xml:space="preserve"> El sistema debe permitir registrar partes de emergencia. </w:t>
+            </w:r>
+          </w:p>
+          <w:p>
+            <w:pPr>
+              <w:numPr>
+                <w:ilvl w:val="0"/>
+                <w:numId w:val="5"/>
+              </w:numPr>
+              <w:tabs>
+                <w:tab w:val="center" w:leader="none" w:pos="4320"/>
+                <w:tab w:val="right" w:leader="none" w:pos="8640"/>
+              </w:tabs>
+              <w:spacing w:after="0" w:before="0" w:lineRule="auto"/>
+              <w:ind w:left="720" w:hanging="360"/>
+              <w:rPr>
+                <w:sz w:val="18"/>
+                <w:szCs w:val="18"/>
+              </w:rPr>
+            </w:pPr>
+            <w:r>
+              <w:rPr>
+                <w:b w:val="1"/>
+                <w:bCs w:val="1"/>
+                <w:sz w:val="18"/>
+                <w:szCs w:val="18"/>
+                <w:rtl w:val="0"/>
+              </w:rPr>
+              <w:t xml:space="preserve">RF03:</w:t>
+            </w:r>
+            <w:r>
+              <w:rPr>
+                <w:sz w:val="18"/>
+                <w:szCs w:val="18"/>
+                <w:rtl w:val="0"/>
+              </w:rPr>
+              <w:t xml:space="preserve"> El sistema debe permitir registrar partes de emergencia. </w:t>
+            </w:r>
+          </w:p>
+          <w:p>
+            <w:pPr>
+              <w:numPr>
+                <w:ilvl w:val="0"/>
+                <w:numId w:val="5"/>
+              </w:numPr>
+              <w:tabs>
+                <w:tab w:val="center" w:leader="none" w:pos="4320"/>
+                <w:tab w:val="right" w:leader="none" w:pos="8640"/>
+              </w:tabs>
+              <w:spacing w:after="240" w:before="0" w:lineRule="auto"/>
+              <w:ind w:left="720" w:hanging="360"/>
+              <w:rPr>
+                <w:sz w:val="18"/>
+                <w:szCs w:val="18"/>
+              </w:rPr>
+            </w:pPr>
+            <w:r>
+              <w:rPr>
+                <w:b w:val="1"/>
+                <w:bCs w:val="1"/>
+                <w:sz w:val="18"/>
+                <w:szCs w:val="18"/>
+                <w:rtl w:val="0"/>
+              </w:rPr>
+              <w:t xml:space="preserve">RF05:</w:t>
+            </w:r>
+            <w:r>
+              <w:rPr>
+                <w:sz w:val="18"/>
+                <w:szCs w:val="18"/>
+                <w:rtl w:val="0"/>
+              </w:rPr>
+              <w:t xml:space="preserve"> El sistema debe permitir cambiar el estado o cerrar emergencias. </w:t>
+            </w:r>
+          </w:p>
+          <w:p>
+            <w:pPr>
+              <w:keepNext w:val="0"/>
+              <w:keepLines w:val="0"/>
+              <w:pageBreakBefore w:val="0"/>
+              <w:widowControl w:val="1"/>
+              <w:pBdr>
+                <w:top w:space="0" w:sz="0" w:val="nil"/>
+                <w:left w:space="0" w:sz="0" w:val="nil"/>
+                <w:bottom w:space="0" w:sz="0" w:val="nil"/>
+                <w:right w:space="0" w:sz="0" w:val="nil"/>
+                <w:between w:space="0" w:sz="0" w:val="nil"/>
+              </w:pBdr>
+              <w:shd w:fill="auto" w:val="clear"/>
+              <w:tabs>
+                <w:tab w:val="center" w:leader="none" w:pos="4320"/>
+                <w:tab w:val="right" w:leader="none" w:pos="8640"/>
+              </w:tabs>
+              <w:spacing w:after="40" w:before="240" w:line="240" w:lineRule="auto"/>
+              <w:ind w:left="720" w:right="0" w:hanging="360"/>
+              <w:jc w:val="left"/>
+              <w:rPr>
+                <w:rFonts w:ascii="Arial" w:cs="Arial" w:eastAsia="Arial" w:hAnsi="Arial"/>
+                <w:b w:val="0"/>
+                <w:bCs w:val="0"/>
+                <w:i w:val="0"/>
+                <w:iCs w:val="0"/>
+                <w:smallCaps w:val="0"/>
+                <w:strike w:val="0"/>
+                <w:color w:val="000000"/>
+                <w:sz w:val="18"/>
+                <w:szCs w:val="18"/>
+                <w:u w:val="none"/>
+                <w:shd w:fill="auto" w:val="clear"/>
+                <w:vertAlign w:val="baseline"/>
+              </w:rPr>
+            </w:pPr>
+            <w:bookmarkStart w:colFirst="0" w:colLast="0" w:name="_heading=h.emq2qca73ov3" w:id="3"/>
+            <w:bookmarkEnd w:id="3"/>
+            <w:r>
+              <w:rPr>
+                <w:rFonts w:ascii="Arial" w:cs="Arial" w:eastAsia="Arial" w:hAnsi="Arial"/>
+                <w:b w:val="0"/>
+                <w:bCs w:val="0"/>
+                <w:i w:val="0"/>
+                <w:iCs w:val="0"/>
+                <w:smallCaps w:val="0"/>
+                <w:strike w:val="0"/>
+                <w:color w:val="000000"/>
+                <w:sz w:val="18"/>
+                <w:szCs w:val="18"/>
+                <w:u w:val="none"/>
+                <w:shd w:fill="auto" w:val="clear"/>
+                <w:vertAlign w:val="baseline"/>
+                <w:rtl w:val="0"/>
+              </w:rPr>
+              <w:t xml:space="preserve">3. </w:t>
+            </w:r>
+            <w:r>
+              <w:rPr>
+                <w:sz w:val="18"/>
+                <w:szCs w:val="18"/>
+                <w:rtl w:val="0"/>
+              </w:rPr>
+              <w:t xml:space="preserve">Módulo de Logística </w:t>
+            </w:r>
+            <w:r>
+              <w:rPr>
+                <w:rtl w:val="0"/>
+              </w:rPr>
+            </w:r>
+          </w:p>
+          <w:p>
+            <w:pPr>
+              <w:numPr>
+                <w:ilvl w:val="0"/>
+                <w:numId w:val="10"/>
+              </w:numPr>
+              <w:tabs>
+                <w:tab w:val="center" w:leader="none" w:pos="4320"/>
+                <w:tab w:val="right" w:leader="none" w:pos="8640"/>
+              </w:tabs>
+              <w:spacing w:after="0" w:before="240" w:lineRule="auto"/>
+              <w:ind w:left="720" w:hanging="360"/>
+              <w:rPr>
+                <w:sz w:val="18"/>
+                <w:szCs w:val="18"/>
+              </w:rPr>
+            </w:pPr>
+            <w:r>
+              <w:rPr>
+                <w:b w:val="1"/>
+                <w:bCs w:val="1"/>
+                <w:sz w:val="18"/>
+                <w:szCs w:val="18"/>
+                <w:rtl w:val="0"/>
+              </w:rPr>
+              <w:t xml:space="preserve">RF06:</w:t>
+            </w:r>
+            <w:r>
+              <w:rPr>
+                <w:sz w:val="18"/>
+                <w:szCs w:val="18"/>
+                <w:rtl w:val="0"/>
+              </w:rPr>
+              <w:t xml:space="preserve"> El sistema debe permitir registrar checklist de vehículos. .</w:t>
+            </w:r>
+          </w:p>
+          <w:p>
+            <w:pPr>
+              <w:numPr>
+                <w:ilvl w:val="0"/>
+                <w:numId w:val="10"/>
+              </w:numPr>
+              <w:tabs>
+                <w:tab w:val="center" w:leader="none" w:pos="4320"/>
+                <w:tab w:val="right" w:leader="none" w:pos="8640"/>
+              </w:tabs>
+              <w:spacing w:after="240" w:before="0" w:lineRule="auto"/>
+              <w:ind w:left="720" w:hanging="360"/>
+              <w:rPr>
+                <w:sz w:val="18"/>
+                <w:szCs w:val="18"/>
+              </w:rPr>
+            </w:pPr>
+            <w:r>
+              <w:rPr>
+                <w:b w:val="1"/>
+                <w:bCs w:val="1"/>
+                <w:sz w:val="18"/>
+                <w:szCs w:val="18"/>
+                <w:rtl w:val="0"/>
+              </w:rPr>
+              <w:t xml:space="preserve">RF07:</w:t>
+            </w:r>
+            <w:r>
+              <w:rPr>
+                <w:sz w:val="18"/>
+                <w:szCs w:val="18"/>
+                <w:rtl w:val="0"/>
+              </w:rPr>
+              <w:t xml:space="preserve"> El sistema debe permitir gestionar fichas logísticas de vehículos. </w:t>
+            </w:r>
+          </w:p>
+          <w:p>
+            <w:pPr>
+              <w:keepNext w:val="0"/>
+              <w:keepLines w:val="0"/>
+              <w:pageBreakBefore w:val="0"/>
+              <w:widowControl w:val="1"/>
+              <w:pBdr>
+                <w:top w:space="0" w:sz="0" w:val="nil"/>
+                <w:left w:space="0" w:sz="0" w:val="nil"/>
+                <w:bottom w:space="0" w:sz="0" w:val="nil"/>
+                <w:right w:space="0" w:sz="0" w:val="nil"/>
+                <w:between w:space="0" w:sz="0" w:val="nil"/>
+              </w:pBdr>
+              <w:shd w:fill="auto" w:val="clear"/>
+              <w:tabs>
+                <w:tab w:val="center" w:leader="none" w:pos="4320"/>
+                <w:tab w:val="right" w:leader="none" w:pos="8640"/>
+              </w:tabs>
+              <w:spacing w:after="40" w:before="240" w:line="240" w:lineRule="auto"/>
+              <w:ind w:left="720" w:right="0" w:hanging="360"/>
+              <w:jc w:val="left"/>
+              <w:rPr>
+                <w:rFonts w:ascii="Arial" w:cs="Arial" w:eastAsia="Arial" w:hAnsi="Arial"/>
+                <w:b w:val="0"/>
+                <w:bCs w:val="0"/>
+                <w:i w:val="0"/>
+                <w:iCs w:val="0"/>
+                <w:smallCaps w:val="0"/>
+                <w:strike w:val="0"/>
+                <w:color w:val="000000"/>
+                <w:sz w:val="18"/>
+                <w:szCs w:val="18"/>
+                <w:u w:val="none"/>
+                <w:shd w:fill="auto" w:val="clear"/>
+                <w:vertAlign w:val="baseline"/>
+              </w:rPr>
+            </w:pPr>
+            <w:bookmarkStart w:colFirst="0" w:colLast="0" w:name="_heading=h.15tzce7hwf9a" w:id="4"/>
+            <w:bookmarkEnd w:id="4"/>
+            <w:r>
+              <w:rPr>
+                <w:rFonts w:ascii="Arial" w:cs="Arial" w:eastAsia="Arial" w:hAnsi="Arial"/>
+                <w:b w:val="0"/>
+                <w:bCs w:val="0"/>
+                <w:i w:val="0"/>
+                <w:iCs w:val="0"/>
+                <w:smallCaps w:val="0"/>
+                <w:strike w:val="0"/>
+                <w:color w:val="000000"/>
+                <w:sz w:val="18"/>
+                <w:szCs w:val="18"/>
+                <w:u w:val="none"/>
+                <w:shd w:fill="auto" w:val="clear"/>
+                <w:vertAlign w:val="baseline"/>
+                <w:rtl w:val="0"/>
+              </w:rPr>
+              <w:t xml:space="preserve">4. </w:t>
+            </w:r>
+            <w:r>
+              <w:rPr>
+                <w:sz w:val="18"/>
+                <w:szCs w:val="18"/>
+                <w:rtl w:val="0"/>
+              </w:rPr>
+              <w:t xml:space="preserve">Módulo RRHH </w:t>
+            </w:r>
+            <w:r>
+              <w:rPr>
+                <w:rtl w:val="0"/>
+              </w:rPr>
+            </w:r>
+          </w:p>
+          <w:p>
+            <w:pPr>
+              <w:numPr>
+                <w:ilvl w:val="0"/>
+                <w:numId w:val="8"/>
+              </w:numPr>
+              <w:tabs>
+                <w:tab w:val="center" w:leader="none" w:pos="4320"/>
+                <w:tab w:val="right" w:leader="none" w:pos="8640"/>
+              </w:tabs>
+              <w:spacing w:before="240" w:lineRule="auto"/>
+              <w:ind w:left="720" w:hanging="360"/>
+              <w:rPr>
+                <w:sz w:val="18"/>
+                <w:szCs w:val="18"/>
+              </w:rPr>
+            </w:pPr>
+            <w:r>
+              <w:rPr>
+                <w:b w:val="1"/>
+                <w:bCs w:val="1"/>
+                <w:sz w:val="18"/>
+                <w:szCs w:val="18"/>
+                <w:rtl w:val="0"/>
+              </w:rPr>
+              <w:t xml:space="preserve">RF08:</w:t>
+            </w:r>
+            <w:r>
+              <w:rPr>
+                <w:sz w:val="18"/>
+                <w:szCs w:val="18"/>
+                <w:rtl w:val="0"/>
+              </w:rPr>
+              <w:t xml:space="preserve"> El sistema debe permitir solicitar licencias médicas. </w:t>
+            </w:r>
+          </w:p>
+          <w:p>
+            <w:pPr>
+              <w:numPr>
+                <w:ilvl w:val="0"/>
+                <w:numId w:val="8"/>
+              </w:numPr>
+              <w:tabs>
+                <w:tab w:val="center" w:leader="none" w:pos="4320"/>
+                <w:tab w:val="right" w:leader="none" w:pos="8640"/>
+              </w:tabs>
+              <w:spacing w:after="240" w:lineRule="auto"/>
+              <w:ind w:left="720" w:hanging="360"/>
+              <w:rPr>
+                <w:sz w:val="18"/>
+                <w:szCs w:val="18"/>
+              </w:rPr>
+            </w:pPr>
+            <w:r>
+              <w:rPr>
+                <w:b w:val="1"/>
+                <w:bCs w:val="1"/>
+                <w:sz w:val="18"/>
+                <w:szCs w:val="18"/>
+                <w:rtl w:val="0"/>
+              </w:rPr>
+              <w:t xml:space="preserve">RF09:</w:t>
+            </w:r>
+            <w:r>
+              <w:rPr>
+                <w:sz w:val="18"/>
+                <w:szCs w:val="18"/>
+                <w:rtl w:val="0"/>
+              </w:rPr>
+              <w:t xml:space="preserve"> El sistema debe permitir resolver licencias médicas. </w:t>
+            </w:r>
+          </w:p>
+          <w:p>
+            <w:pPr>
+              <w:numPr>
+                <w:ilvl w:val="0"/>
+                <w:numId w:val="8"/>
+              </w:numPr>
+              <w:tabs>
+                <w:tab w:val="center" w:leader="none" w:pos="4320"/>
+                <w:tab w:val="right" w:leader="none" w:pos="8640"/>
+              </w:tabs>
+              <w:spacing w:after="240" w:lineRule="auto"/>
+              <w:ind w:left="720" w:hanging="360"/>
+              <w:rPr>
+                <w:sz w:val="18"/>
+                <w:szCs w:val="18"/>
+              </w:rPr>
+            </w:pPr>
+            <w:r>
+              <w:rPr>
+                <w:b w:val="1"/>
+                <w:bCs w:val="1"/>
+                <w:sz w:val="18"/>
+                <w:szCs w:val="18"/>
+                <w:rtl w:val="0"/>
+              </w:rPr>
+              <w:t xml:space="preserve">RF09:</w:t>
+            </w:r>
+            <w:r>
+              <w:rPr>
+                <w:sz w:val="18"/>
+                <w:szCs w:val="18"/>
+                <w:rtl w:val="0"/>
+              </w:rPr>
+              <w:t xml:space="preserve"> El sistema debe permitir resolver licencias médicas. </w:t>
+            </w:r>
+            <w:r>
+              <w:rPr>
+                <w:rtl w:val="0"/>
+              </w:rPr>
+            </w:r>
+          </w:p>
+          <w:p>
+            <w:pPr>
+              <w:keepNext w:val="0"/>
+              <w:keepLines w:val="0"/>
+              <w:pageBreakBefore w:val="0"/>
+              <w:widowControl w:val="1"/>
+              <w:pBdr>
+                <w:top w:space="0" w:sz="0" w:val="nil"/>
+                <w:left w:space="0" w:sz="0" w:val="nil"/>
+                <w:bottom w:space="0" w:sz="0" w:val="nil"/>
+                <w:right w:space="0" w:sz="0" w:val="nil"/>
+                <w:between w:space="0" w:sz="0" w:val="nil"/>
+              </w:pBdr>
+              <w:shd w:fill="auto" w:val="clear"/>
+              <w:tabs>
+                <w:tab w:val="center" w:leader="none" w:pos="4320"/>
+                <w:tab w:val="right" w:leader="none" w:pos="8640"/>
+              </w:tabs>
+              <w:spacing w:after="40" w:before="240" w:line="240" w:lineRule="auto"/>
+              <w:ind w:left="720" w:right="0" w:hanging="360"/>
+              <w:jc w:val="left"/>
+              <w:rPr>
+                <w:rFonts w:ascii="Arial" w:cs="Arial" w:eastAsia="Arial" w:hAnsi="Arial"/>
+                <w:b w:val="0"/>
+                <w:bCs w:val="0"/>
+                <w:i w:val="1"/>
+                <w:iCs w:val="1"/>
+                <w:smallCaps w:val="0"/>
+                <w:strike w:val="0"/>
+                <w:color w:val="000000"/>
+                <w:sz w:val="18"/>
+                <w:szCs w:val="18"/>
+                <w:u w:val="none"/>
+                <w:shd w:fill="auto" w:val="clear"/>
+                <w:vertAlign w:val="baseline"/>
+              </w:rPr>
+            </w:pPr>
+            <w:bookmarkStart w:colFirst="0" w:colLast="0" w:name="_heading=h.p62y8lodggzu" w:id="5"/>
+            <w:bookmarkEnd w:id="5"/>
+            <w:r>
+              <w:rPr>
+                <w:rFonts w:ascii="Arial" w:cs="Arial" w:eastAsia="Arial" w:hAnsi="Arial"/>
+                <w:b w:val="0"/>
+                <w:bCs w:val="0"/>
+                <w:i w:val="0"/>
+                <w:iCs w:val="0"/>
+                <w:smallCaps w:val="0"/>
+                <w:strike w:val="0"/>
+                <w:color w:val="000000"/>
+                <w:sz w:val="18"/>
+                <w:szCs w:val="18"/>
+                <w:u w:val="none"/>
+                <w:shd w:fill="auto" w:val="clear"/>
+                <w:vertAlign w:val="baseline"/>
+                <w:rtl w:val="0"/>
+              </w:rPr>
+              <w:t xml:space="preserve">5. </w:t>
+            </w:r>
+            <w:r>
+              <w:rPr>
+                <w:sz w:val="18"/>
+                <w:szCs w:val="18"/>
+                <w:rtl w:val="0"/>
+              </w:rPr>
+              <w:t xml:space="preserve">Módulo de Analítica </w:t>
+            </w:r>
+            <w:r>
+              <w:rPr>
+                <w:rtl w:val="0"/>
+              </w:rPr>
             </w:r>
           </w:p>
           <w:p>
@@ -1457,7 +2063,7 @@
                 <w:tab w:val="center" w:leader="none" w:pos="4320"/>
                 <w:tab w:val="right" w:leader="none" w:pos="8640"/>
               </w:tabs>
-              <w:spacing w:after="0" w:afterAutospacing="0" w:before="240" w:lineRule="auto"/>
+              <w:spacing w:before="240" w:lineRule="auto"/>
               <w:ind w:left="720" w:hanging="360"/>
               <w:rPr>
                 <w:sz w:val="18"/>
@@ -1466,11 +2072,26 @@
             </w:pPr>
             <w:r>
               <w:rPr>
-                <w:sz w:val="18"/>
-                <w:szCs w:val="18"/>
-                <w:rtl w:val="0"/>
-              </w:rPr>
-              <w:t xml:space="preserve">RF03: El sistema debe permitir la creación de órdenes de trabajo para los vehículos registrados.</w:t>
+                <w:b w:val="1"/>
+                <w:bCs w:val="1"/>
+                <w:sz w:val="18"/>
+                <w:szCs w:val="18"/>
+                <w:rtl w:val="0"/>
+              </w:rPr>
+              <w:t xml:space="preserve">RF11:</w:t>
+            </w:r>
+            <w:r>
+              <w:rPr>
+                <w:sz w:val="18"/>
+                <w:szCs w:val="18"/>
+                <w:rtl w:val="0"/>
+              </w:rPr>
+              <w:t xml:space="preserve"> El sistema debe permitir visualizar un dashboard operativo. </w:t>
+            </w:r>
+            <w:r>
+              <w:rPr>
+                <w:rtl w:val="0"/>
+              </w:rPr>
             </w:r>
           </w:p>
           <w:p>
@@ -1483,7 +2104,7 @@
                 <w:tab w:val="center" w:leader="none" w:pos="4320"/>
                 <w:tab w:val="right" w:leader="none" w:pos="8640"/>
               </w:tabs>
-              <w:spacing w:after="0" w:afterAutospacing="0" w:before="0" w:beforeAutospacing="0" w:lineRule="auto"/>
+              <w:spacing w:after="240" w:lineRule="auto"/>
               <w:ind w:left="720" w:hanging="360"/>
               <w:rPr>
                 <w:sz w:val="18"/>
@@ -1492,11 +2113,98 @@
             </w:pPr>
             <w:r>
               <w:rPr>
-                <w:sz w:val="18"/>
-                <w:szCs w:val="18"/>
-                <w:rtl w:val="0"/>
-              </w:rPr>
-              <w:t xml:space="preserve">RF04: El sistema debe permitir asignar un mecánico a cada orden de trabajo.</w:t>
+                <w:b w:val="1"/>
+                <w:bCs w:val="1"/>
+                <w:sz w:val="18"/>
+                <w:szCs w:val="18"/>
+                <w:rtl w:val="0"/>
+              </w:rPr>
+              <w:t xml:space="preserve">RF12:</w:t>
+            </w:r>
+            <w:r>
+              <w:rPr>
+                <w:sz w:val="18"/>
+                <w:szCs w:val="18"/>
+                <w:rtl w:val="0"/>
+              </w:rPr>
+              <w:t xml:space="preserve"> El sistema debe permitir generar reportes. </w:t>
+            </w:r>
+            <w:r>
+              <w:rPr>
+                <w:rtl w:val="0"/>
+              </w:rPr>
+            </w:r>
+          </w:p>
+          <w:p>
+            <w:pPr>
+              <w:keepNext w:val="0"/>
+              <w:keepLines w:val="0"/>
+              <w:pageBreakBefore w:val="0"/>
+              <w:widowControl w:val="1"/>
+              <w:pBdr>
+                <w:top w:space="0" w:sz="0" w:val="nil"/>
+                <w:left w:space="0" w:sz="0" w:val="nil"/>
+                <w:bottom w:space="0" w:sz="0" w:val="nil"/>
+                <w:right w:space="0" w:sz="0" w:val="nil"/>
+                <w:between w:space="0" w:sz="0" w:val="nil"/>
+              </w:pBdr>
+              <w:shd w:fill="auto" w:val="clear"/>
+              <w:tabs>
+                <w:tab w:val="center" w:leader="none" w:pos="4320"/>
+                <w:tab w:val="right" w:leader="none" w:pos="8640"/>
+              </w:tabs>
+              <w:spacing w:after="40" w:before="240" w:line="240" w:lineRule="auto"/>
+              <w:ind w:left="720" w:right="0" w:hanging="360"/>
+              <w:jc w:val="left"/>
+              <w:rPr>
+                <w:rFonts w:ascii="Arial" w:cs="Arial" w:eastAsia="Arial" w:hAnsi="Arial"/>
+                <w:b w:val="0"/>
+                <w:bCs w:val="0"/>
+                <w:i w:val="0"/>
+                <w:iCs w:val="0"/>
+                <w:smallCaps w:val="0"/>
+                <w:strike w:val="0"/>
+                <w:color w:val="000000"/>
+                <w:sz w:val="18"/>
+                <w:szCs w:val="18"/>
+                <w:u w:val="none"/>
+                <w:shd w:fill="auto" w:val="clear"/>
+                <w:vertAlign w:val="baseline"/>
+              </w:rPr>
+            </w:pPr>
+            <w:bookmarkStart w:colFirst="0" w:colLast="0" w:name="_heading=h.hmyfvvsraym6" w:id="6"/>
+            <w:bookmarkEnd w:id="6"/>
+            <w:r>
+              <w:rPr>
+                <w:rFonts w:ascii="Arial" w:cs="Arial" w:eastAsia="Arial" w:hAnsi="Arial"/>
+                <w:b w:val="0"/>
+                <w:bCs w:val="0"/>
+                <w:i w:val="0"/>
+                <w:iCs w:val="0"/>
+                <w:smallCaps w:val="0"/>
+                <w:strike w:val="0"/>
+                <w:color w:val="000000"/>
+                <w:sz w:val="18"/>
+                <w:szCs w:val="18"/>
+                <w:u w:val="none"/>
+                <w:shd w:fill="auto" w:val="clear"/>
+                <w:vertAlign w:val="baseline"/>
+                <w:rtl w:val="0"/>
+              </w:rPr>
+              <w:t xml:space="preserve">6. </w:t>
+            </w:r>
+            <w:r>
+              <w:rPr>
+                <w:sz w:val="18"/>
+                <w:szCs w:val="18"/>
+                <w:rtl w:val="0"/>
+              </w:rPr>
+              <w:t xml:space="preserve">Módulo de Auditoría </w:t>
+            </w:r>
+            <w:r>
+              <w:rPr>
+                <w:rtl w:val="0"/>
+              </w:rPr>
             </w:r>
           </w:p>
           <w:p>
@@ -1509,7 +2217,7 @@
                 <w:tab w:val="center" w:leader="none" w:pos="4320"/>
                 <w:tab w:val="right" w:leader="none" w:pos="8640"/>
               </w:tabs>
-              <w:spacing w:after="240" w:before="0" w:beforeAutospacing="0" w:lineRule="auto"/>
+              <w:spacing w:after="0" w:before="240" w:lineRule="auto"/>
               <w:ind w:left="720" w:hanging="360"/>
               <w:rPr>
                 <w:sz w:val="18"/>
@@ -1518,17 +2226,61 @@
             </w:pPr>
             <w:r>
               <w:rPr>
-                <w:sz w:val="18"/>
-                <w:szCs w:val="18"/>
-                <w:rtl w:val="0"/>
-              </w:rPr>
-              <w:t xml:space="preserve">RF05: El sistema debe generar una factura al finalizar una orden de trabajo.</w:t>
-            </w:r>
-          </w:p>
-          <w:p>
-            <w:pPr>
-              <w:pStyle w:val="Heading4"/>
-              <w:keepNext w:val="0"/>
+                <w:b w:val="1"/>
+                <w:bCs w:val="1"/>
+                <w:sz w:val="18"/>
+                <w:szCs w:val="18"/>
+                <w:rtl w:val="0"/>
+              </w:rPr>
+              <w:t xml:space="preserve">RF13:</w:t>
+            </w:r>
+            <w:r>
+              <w:rPr>
+                <w:sz w:val="18"/>
+                <w:szCs w:val="18"/>
+                <w:rtl w:val="0"/>
+              </w:rPr>
+              <w:t xml:space="preserve"> El sistema debe registrar automáticamente las acciones relevantes. </w:t>
+            </w:r>
+          </w:p>
+          <w:p>
+            <w:pPr>
+              <w:numPr>
+                <w:ilvl w:val="0"/>
+                <w:numId w:val="4"/>
+              </w:numPr>
+              <w:tabs>
+                <w:tab w:val="center" w:leader="none" w:pos="4320"/>
+                <w:tab w:val="right" w:leader="none" w:pos="8640"/>
+              </w:tabs>
+              <w:spacing w:after="240" w:before="0" w:lineRule="auto"/>
+              <w:ind w:left="720" w:hanging="360"/>
+              <w:rPr>
+                <w:sz w:val="18"/>
+                <w:szCs w:val="18"/>
+              </w:rPr>
+            </w:pPr>
+            <w:r>
+              <w:rPr>
+                <w:b w:val="1"/>
+                <w:bCs w:val="1"/>
+                <w:sz w:val="18"/>
+                <w:szCs w:val="18"/>
+                <w:rtl w:val="0"/>
+              </w:rPr>
+              <w:t xml:space="preserve">RF14:</w:t>
+            </w:r>
+            <w:r>
+              <w:rPr>
+                <w:sz w:val="18"/>
+                <w:szCs w:val="18"/>
+                <w:rtl w:val="0"/>
+              </w:rPr>
+              <w:t xml:space="preserve"> El sistema debe permitir consultar auditorías de acciones. </w:t>
+            </w:r>
+          </w:p>
+          <w:p>
+            <w:pPr>
               <w:tabs>
                 <w:tab w:val="center" w:leader="none" w:pos="4320"/>
                 <w:tab w:val="right" w:leader="none" w:pos="8640"/>
@@ -1536,30 +2288,32 @@
               <w:spacing w:after="40" w:before="240" w:lineRule="auto"/>
               <w:ind w:left="720" w:hanging="360"/>
               <w:rPr>
-                <w:i w:val="0"/>
-              </w:rPr>
-            </w:pPr>
-            <w:bookmarkStart w:colFirst="0" w:colLast="0" w:name="_heading=h.emq2qca73ov3" w:id="3"/>
-            <w:bookmarkEnd w:id="3"/>
-            <w:r>
-              <w:rPr>
-                <w:i w:val="0"/>
-                <w:rtl w:val="0"/>
-              </w:rPr>
-              <w:t xml:space="preserve">3. Módulo de Reserva de Citas</w:t>
+                <w:sz w:val="18"/>
+                <w:szCs w:val="18"/>
+              </w:rPr>
+            </w:pPr>
+            <w:bookmarkStart w:colFirst="0" w:colLast="0" w:name="_heading=h.hmyfvvsraym6" w:id="6"/>
+            <w:bookmarkEnd w:id="6"/>
+            <w:r>
+              <w:rPr>
+                <w:sz w:val="18"/>
+                <w:szCs w:val="18"/>
+                <w:rtl w:val="0"/>
+              </w:rPr>
+              <w:t xml:space="preserve">7. Servicios Transversales </w:t>
             </w:r>
           </w:p>
           <w:p>
             <w:pPr>
               <w:numPr>
                 <w:ilvl w:val="0"/>
-                <w:numId w:val="9"/>
+                <w:numId w:val="4"/>
               </w:numPr>
               <w:tabs>
                 <w:tab w:val="center" w:leader="none" w:pos="4320"/>
                 <w:tab w:val="right" w:leader="none" w:pos="8640"/>
               </w:tabs>
-              <w:spacing w:after="0" w:afterAutospacing="0" w:before="240" w:lineRule="auto"/>
+              <w:spacing w:before="240" w:lineRule="auto"/>
               <w:ind w:left="720" w:hanging="360"/>
               <w:rPr>
                 <w:sz w:val="18"/>
@@ -1568,24 +2322,39 @@
             </w:pPr>
             <w:r>
               <w:rPr>
-                <w:sz w:val="18"/>
-                <w:szCs w:val="18"/>
-                <w:rtl w:val="0"/>
-              </w:rPr>
-              <w:t xml:space="preserve">RF06: El sistema debe permitir a los clientes reservar citas para el mantenimiento o reparación de sus vehículos en línea.</w:t>
+                <w:b w:val="1"/>
+                <w:bCs w:val="1"/>
+                <w:sz w:val="18"/>
+                <w:szCs w:val="18"/>
+                <w:rtl w:val="0"/>
+              </w:rPr>
+              <w:t xml:space="preserve">RF15:</w:t>
+            </w:r>
+            <w:r>
+              <w:rPr>
+                <w:sz w:val="18"/>
+                <w:szCs w:val="18"/>
+                <w:rtl w:val="0"/>
+              </w:rPr>
+              <w:t xml:space="preserve"> El sistema debe autenticar a los usuarios antes de acceder. </w:t>
+            </w:r>
+            <w:r>
+              <w:rPr>
+                <w:rtl w:val="0"/>
+              </w:rPr>
             </w:r>
           </w:p>
           <w:p>
             <w:pPr>
               <w:numPr>
                 <w:ilvl w:val="0"/>
-                <w:numId w:val="9"/>
+                <w:numId w:val="4"/>
               </w:numPr>
               <w:tabs>
                 <w:tab w:val="center" w:leader="none" w:pos="4320"/>
                 <w:tab w:val="right" w:leader="none" w:pos="8640"/>
               </w:tabs>
-              <w:spacing w:after="240" w:before="0" w:beforeAutospacing="0" w:lineRule="auto"/>
+              <w:spacing w:after="240" w:lineRule="auto"/>
               <w:ind w:left="720" w:hanging="360"/>
               <w:rPr>
                 <w:sz w:val="18"/>
@@ -1594,227 +2363,22 @@
             </w:pPr>
             <w:r>
               <w:rPr>
-                <w:sz w:val="18"/>
-                <w:szCs w:val="18"/>
-                <w:rtl w:val="0"/>
-              </w:rPr>
-              <w:t xml:space="preserve">RF07: El sistema debe mostrar la disponibilidad de fechas y horas para las reservas.</w:t>
-            </w:r>
-          </w:p>
-          <w:p>
-            <w:pPr>
-              <w:pStyle w:val="Heading4"/>
-              <w:keepNext w:val="0"/>
-              <w:tabs>
-                <w:tab w:val="center" w:leader="none" w:pos="4320"/>
-                <w:tab w:val="right" w:leader="none" w:pos="8640"/>
-              </w:tabs>
-              <w:spacing w:after="40" w:before="240" w:lineRule="auto"/>
-              <w:ind w:left="720" w:hanging="360"/>
-              <w:rPr>
-                <w:i w:val="0"/>
-              </w:rPr>
-            </w:pPr>
-            <w:bookmarkStart w:colFirst="0" w:colLast="0" w:name="_heading=h.15tzce7hwf9a" w:id="4"/>
-            <w:bookmarkEnd w:id="4"/>
-            <w:r>
-              <w:rPr>
-                <w:i w:val="0"/>
-                <w:rtl w:val="0"/>
-              </w:rPr>
-              <w:t xml:space="preserve">4. Módulo de Comunicación con Clientes</w:t>
-            </w:r>
-          </w:p>
-          <w:p>
-            <w:pPr>
-              <w:numPr>
-                <w:ilvl w:val="0"/>
-                <w:numId w:val="7"/>
-              </w:numPr>
-              <w:tabs>
-                <w:tab w:val="center" w:leader="none" w:pos="4320"/>
-                <w:tab w:val="right" w:leader="none" w:pos="8640"/>
-              </w:tabs>
-              <w:spacing w:after="240" w:before="240" w:lineRule="auto"/>
-              <w:ind w:left="720" w:hanging="360"/>
-              <w:rPr>
-                <w:sz w:val="18"/>
-                <w:szCs w:val="18"/>
-              </w:rPr>
-            </w:pPr>
-            <w:r>
-              <w:rPr>
-                <w:sz w:val="18"/>
-                <w:szCs w:val="18"/>
-                <w:rtl w:val="0"/>
-              </w:rPr>
-              <w:t xml:space="preserve">RF08: El sistema debe notificar al cliente el estado de su vehículo por correo electrónico.</w:t>
-            </w:r>
-          </w:p>
-          <w:p>
-            <w:pPr>
-              <w:pStyle w:val="Heading4"/>
-              <w:keepNext w:val="0"/>
-              <w:tabs>
-                <w:tab w:val="center" w:leader="none" w:pos="4320"/>
-                <w:tab w:val="right" w:leader="none" w:pos="8640"/>
-              </w:tabs>
-              <w:spacing w:after="40" w:before="240" w:lineRule="auto"/>
-              <w:ind w:left="720" w:hanging="360"/>
-              <w:rPr>
-                <w:sz w:val="18"/>
-                <w:szCs w:val="18"/>
-              </w:rPr>
-            </w:pPr>
-            <w:bookmarkStart w:colFirst="0" w:colLast="0" w:name="_heading=h.p62y8lodggzu" w:id="5"/>
-            <w:bookmarkEnd w:id="5"/>
-            <w:r>
-              <w:rPr>
-                <w:i w:val="0"/>
-                <w:rtl w:val="0"/>
-              </w:rPr>
-              <w:t xml:space="preserve">5. Módulo de Seguimiento de Reparaciones</w:t>
-            </w:r>
-            <w:r>
-              <w:rPr>
-                <w:rtl w:val="0"/>
-              </w:rPr>
-            </w:r>
-          </w:p>
-          <w:p>
-            <w:pPr>
-              <w:numPr>
-                <w:ilvl w:val="0"/>
-                <w:numId w:val="2"/>
-              </w:numPr>
-              <w:tabs>
-                <w:tab w:val="center" w:leader="none" w:pos="4320"/>
-                <w:tab w:val="right" w:leader="none" w:pos="8640"/>
-              </w:tabs>
-              <w:spacing w:after="240" w:before="240" w:lineRule="auto"/>
-              <w:ind w:left="720" w:hanging="360"/>
-              <w:rPr>
-                <w:sz w:val="18"/>
-                <w:szCs w:val="18"/>
-              </w:rPr>
-            </w:pPr>
-            <w:r>
-              <w:rPr>
-                <w:sz w:val="18"/>
-                <w:szCs w:val="18"/>
-                <w:rtl w:val="0"/>
-              </w:rPr>
-              <w:t xml:space="preserve">RF09: El sistema debe mostrar un resumen del progreso de la reparación (por ejemplo, "Diagnóstico completado", "Reparación en curso", "Reparación finalizada").</w:t>
-            </w:r>
-          </w:p>
-          <w:p>
-            <w:pPr>
-              <w:pStyle w:val="Heading4"/>
-              <w:keepNext w:val="0"/>
-              <w:tabs>
-                <w:tab w:val="center" w:leader="none" w:pos="4320"/>
-                <w:tab w:val="right" w:leader="none" w:pos="8640"/>
-              </w:tabs>
-              <w:spacing w:after="40" w:before="240" w:lineRule="auto"/>
-              <w:ind w:left="720" w:hanging="360"/>
-              <w:rPr>
-                <w:i w:val="0"/>
-              </w:rPr>
-            </w:pPr>
-            <w:bookmarkStart w:colFirst="0" w:colLast="0" w:name="_heading=h.hmyfvvsraym6" w:id="6"/>
-            <w:bookmarkEnd w:id="6"/>
-            <w:r>
-              <w:rPr>
-                <w:i w:val="0"/>
-                <w:rtl w:val="0"/>
-              </w:rPr>
-              <w:t xml:space="preserve">6. Módulo de Pagos en línea</w:t>
-            </w:r>
-          </w:p>
-          <w:p>
-            <w:pPr>
-              <w:numPr>
-                <w:ilvl w:val="0"/>
-                <w:numId w:val="2"/>
-              </w:numPr>
-              <w:tabs>
-                <w:tab w:val="center" w:leader="none" w:pos="4320"/>
-                <w:tab w:val="right" w:leader="none" w:pos="8640"/>
-              </w:tabs>
-              <w:spacing w:after="0" w:afterAutospacing="0" w:before="240" w:lineRule="auto"/>
-              <w:ind w:left="720" w:hanging="360"/>
-              <w:rPr>
-                <w:sz w:val="18"/>
-                <w:szCs w:val="18"/>
-              </w:rPr>
-            </w:pPr>
-            <w:r>
-              <w:rPr>
-                <w:sz w:val="18"/>
-                <w:szCs w:val="18"/>
-                <w:rtl w:val="0"/>
-              </w:rPr>
-              <w:t xml:space="preserve">RF10: El sistema debe permitir que se paguen los servicios realizados mediante la aplicación</w:t>
-            </w:r>
-          </w:p>
-          <w:p>
-            <w:pPr>
-              <w:numPr>
-                <w:ilvl w:val="0"/>
-                <w:numId w:val="2"/>
-              </w:numPr>
-              <w:tabs>
-                <w:tab w:val="center" w:leader="none" w:pos="4320"/>
-                <w:tab w:val="right" w:leader="none" w:pos="8640"/>
-              </w:tabs>
-              <w:spacing w:after="240" w:before="0" w:beforeAutospacing="0" w:lineRule="auto"/>
-              <w:ind w:left="720" w:hanging="360"/>
-              <w:rPr>
-                <w:sz w:val="18"/>
-                <w:szCs w:val="18"/>
-              </w:rPr>
-            </w:pPr>
-            <w:r>
-              <w:rPr>
-                <w:sz w:val="18"/>
-                <w:szCs w:val="18"/>
-                <w:rtl w:val="0"/>
-              </w:rPr>
-              <w:t xml:space="preserve">RF11: El sistema debe mostrar el total a pagar y mostrar distintos métodos de pago</w:t>
-            </w:r>
-          </w:p>
-          <w:p>
-            <w:pPr>
-              <w:tabs>
-                <w:tab w:val="center" w:leader="none" w:pos="4320"/>
-                <w:tab w:val="right" w:leader="none" w:pos="8640"/>
-              </w:tabs>
-              <w:spacing w:after="60" w:lineRule="auto"/>
-              <w:ind w:left="0" w:firstLine="0"/>
-              <w:rPr>
-                <w:sz w:val="18"/>
-                <w:szCs w:val="18"/>
-              </w:rPr>
-            </w:pPr>
-            <w:r>
-              <w:rPr>
-                <w:rtl w:val="0"/>
-              </w:rPr>
-            </w:r>
-          </w:p>
-          <w:p>
-            <w:pPr>
-              <w:tabs>
-                <w:tab w:val="center" w:leader="none" w:pos="4320"/>
-                <w:tab w:val="right" w:leader="none" w:pos="8640"/>
-              </w:tabs>
-              <w:spacing w:after="60" w:before="0" w:lineRule="auto"/>
-              <w:ind w:left="0" w:firstLine="0"/>
-              <w:rPr>
-                <w:sz w:val="18"/>
-                <w:szCs w:val="18"/>
-              </w:rPr>
-            </w:pPr>
+                <w:b w:val="1"/>
+                <w:bCs w:val="1"/>
+                <w:sz w:val="18"/>
+                <w:szCs w:val="18"/>
+                <w:rtl w:val="0"/>
+              </w:rPr>
+              <w:t xml:space="preserve">RF16:</w:t>
+            </w:r>
+            <w:r>
+              <w:rPr>
+                <w:sz w:val="18"/>
+                <w:szCs w:val="18"/>
+                <w:rtl w:val="0"/>
+              </w:rPr>
+              <w:t xml:space="preserve"> El sistema debe autorizar acciones según roles y permisos. </w:t>
+            </w:r>
             <w:r>
               <w:rPr>
                 <w:rtl w:val="0"/>
@@ -1854,14 +2418,16 @@
               <w:jc w:val="both"/>
               <w:rPr>
                 <w:b w:val="1"/>
-                <w:color w:val="000000"/>
-                <w:sz w:val="18"/>
-                <w:szCs w:val="18"/>
-              </w:rPr>
-            </w:pPr>
-            <w:r>
-              <w:rPr>
-                <w:b w:val="1"/>
+                <w:bCs w:val="1"/>
+                <w:color w:val="000000"/>
+                <w:sz w:val="18"/>
+                <w:szCs w:val="18"/>
+              </w:rPr>
+            </w:pPr>
+            <w:r>
+              <w:rPr>
+                <w:b w:val="1"/>
+                <w:bCs w:val="1"/>
                 <w:sz w:val="18"/>
                 <w:szCs w:val="18"/>
                 <w:rtl w:val="0"/>
@@ -1920,46 +2486,74 @@
           </w:p>
           <w:p>
             <w:pPr>
-              <w:pStyle w:val="Heading4"/>
               <w:keepNext w:val="0"/>
-              <w:tabs>
-                <w:tab w:val="center" w:leader="none" w:pos="4320"/>
-                <w:tab w:val="right" w:leader="none" w:pos="8640"/>
-              </w:tabs>
-              <w:spacing w:after="40" w:before="240" w:lineRule="auto"/>
-              <w:ind w:left="0" w:firstLine="0"/>
-              <w:rPr>
+              <w:keepLines w:val="0"/>
+              <w:pageBreakBefore w:val="0"/>
+              <w:widowControl w:val="1"/>
+              <w:pBdr>
+                <w:top w:space="0" w:sz="0" w:val="nil"/>
+                <w:left w:space="0" w:sz="0" w:val="nil"/>
+                <w:bottom w:space="0" w:sz="0" w:val="nil"/>
+                <w:right w:space="0" w:sz="0" w:val="nil"/>
+                <w:between w:space="0" w:sz="0" w:val="nil"/>
+              </w:pBdr>
+              <w:shd w:fill="auto" w:val="clear"/>
+              <w:tabs>
+                <w:tab w:val="center" w:leader="none" w:pos="4320"/>
+                <w:tab w:val="right" w:leader="none" w:pos="8640"/>
+              </w:tabs>
+              <w:spacing w:after="40" w:before="240" w:line="240" w:lineRule="auto"/>
+              <w:ind w:left="0" w:right="0" w:firstLine="0"/>
+              <w:jc w:val="left"/>
+              <w:rPr>
+                <w:rFonts w:ascii="Arial" w:cs="Arial" w:eastAsia="Arial" w:hAnsi="Arial"/>
+                <w:b w:val="0"/>
+                <w:bCs w:val="0"/>
                 <w:i w:val="0"/>
+                <w:iCs w:val="0"/>
+                <w:smallCaps w:val="0"/>
+                <w:strike w:val="0"/>
+                <w:color w:val="000000"/>
+                <w:sz w:val="18"/>
+                <w:szCs w:val="18"/>
+                <w:u w:val="none"/>
+                <w:shd w:fill="auto" w:val="clear"/>
+                <w:vertAlign w:val="baseline"/>
               </w:rPr>
             </w:pPr>
             <w:bookmarkStart w:colFirst="0" w:colLast="0" w:name="_heading=h.b78jhx9r3g9s" w:id="7"/>
             <w:bookmarkEnd w:id="7"/>
             <w:r>
               <w:rPr>
+                <w:rFonts w:ascii="Arial" w:cs="Arial" w:eastAsia="Arial" w:hAnsi="Arial"/>
+                <w:b w:val="0"/>
+                <w:bCs w:val="0"/>
                 <w:i w:val="0"/>
-                <w:rtl w:val="0"/>
-              </w:rPr>
-              <w:t xml:space="preserve">       </w:t>
-            </w:r>
-            <w:r>
-              <w:rPr>
-                <w:i w:val="0"/>
-                <w:rtl w:val="0"/>
-              </w:rPr>
-              <w:t xml:space="preserve">1. Rendimiento</w:t>
+                <w:iCs w:val="0"/>
+                <w:smallCaps w:val="0"/>
+                <w:strike w:val="0"/>
+                <w:color w:val="000000"/>
+                <w:sz w:val="18"/>
+                <w:szCs w:val="18"/>
+                <w:u w:val="none"/>
+                <w:shd w:fill="auto" w:val="clear"/>
+                <w:vertAlign w:val="baseline"/>
+                <w:rtl w:val="0"/>
+              </w:rPr>
+              <w:t xml:space="preserve">       1. Rendimiento</w:t>
             </w:r>
           </w:p>
           <w:p>
             <w:pPr>
               <w:numPr>
                 <w:ilvl w:val="0"/>
-                <w:numId w:val="11"/>
+                <w:numId w:val="3"/>
               </w:numPr>
               <w:tabs>
                 <w:tab w:val="center" w:leader="none" w:pos="4320"/>
                 <w:tab w:val="right" w:leader="none" w:pos="8640"/>
               </w:tabs>
-              <w:spacing w:after="0" w:afterAutospacing="0" w:before="240" w:lineRule="auto"/>
+              <w:spacing w:after="0" w:before="240" w:lineRule="auto"/>
               <w:ind w:left="720" w:hanging="360"/>
               <w:rPr>
                 <w:sz w:val="18"/>
@@ -1968,32 +2562,34 @@
             </w:pPr>
             <w:r>
               <w:rPr>
-                <w:sz w:val="18"/>
-                <w:szCs w:val="18"/>
-                <w:rtl w:val="0"/>
-              </w:rPr>
-              <w:t xml:space="preserve">RNF01</w:t>
-            </w:r>
-            <w:r>
-              <w:rPr>
-                <w:sz w:val="18"/>
-                <w:szCs w:val="18"/>
-                <w:rtl w:val="0"/>
-              </w:rPr>
-              <w:t xml:space="preserve">: El sistema debe ser capaz de manejar al menos 100 usuarios concurrentes.</w:t>
+                <w:b w:val="1"/>
+                <w:bCs w:val="1"/>
+                <w:sz w:val="18"/>
+                <w:szCs w:val="18"/>
+                <w:rtl w:val="0"/>
+              </w:rPr>
+              <w:t xml:space="preserve">RNF01:</w:t>
+            </w:r>
+            <w:r>
+              <w:rPr>
+                <w:sz w:val="18"/>
+                <w:szCs w:val="18"/>
+                <w:rtl w:val="0"/>
+              </w:rPr>
+              <w:t xml:space="preserve"> El sistema debe soportar múltiples usuarios concurrentes. </w:t>
             </w:r>
           </w:p>
           <w:p>
             <w:pPr>
               <w:numPr>
                 <w:ilvl w:val="0"/>
-                <w:numId w:val="11"/>
+                <w:numId w:val="3"/>
               </w:numPr>
               <w:tabs>
                 <w:tab w:val="center" w:leader="none" w:pos="4320"/>
                 <w:tab w:val="right" w:leader="none" w:pos="8640"/>
               </w:tabs>
-              <w:spacing w:after="240" w:before="0" w:beforeAutospacing="0" w:lineRule="auto"/>
+              <w:spacing w:after="240" w:before="0" w:lineRule="auto"/>
               <w:ind w:left="720" w:hanging="360"/>
               <w:rPr>
                 <w:sz w:val="18"/>
@@ -2002,63 +2598,93 @@
             </w:pPr>
             <w:r>
               <w:rPr>
-                <w:sz w:val="18"/>
-                <w:szCs w:val="18"/>
-                <w:rtl w:val="0"/>
-              </w:rPr>
-              <w:t xml:space="preserve">RNF02</w:t>
-            </w:r>
-            <w:r>
-              <w:rPr>
-                <w:sz w:val="18"/>
-                <w:szCs w:val="18"/>
-                <w:rtl w:val="0"/>
-              </w:rPr>
-              <w:t xml:space="preserve">: Las páginas deben cargar en un tiempo menor a 5 segundos para usuarios con una conexión promedio.</w:t>
-            </w:r>
-          </w:p>
-          <w:p>
-            <w:pPr>
-              <w:pStyle w:val="Heading4"/>
+                <w:b w:val="1"/>
+                <w:bCs w:val="1"/>
+                <w:sz w:val="18"/>
+                <w:szCs w:val="18"/>
+                <w:rtl w:val="0"/>
+              </w:rPr>
+              <w:t xml:space="preserve">RNF02:</w:t>
+            </w:r>
+            <w:r>
+              <w:rPr>
+                <w:sz w:val="18"/>
+                <w:szCs w:val="18"/>
+                <w:rtl w:val="0"/>
+              </w:rPr>
+              <w:t xml:space="preserve"> El tiempo de respuesta debe ser menor a 3 segundos. </w:t>
+            </w:r>
+          </w:p>
+          <w:p>
+            <w:pPr>
               <w:keepNext w:val="0"/>
-              <w:tabs>
-                <w:tab w:val="center" w:leader="none" w:pos="4320"/>
-                <w:tab w:val="right" w:leader="none" w:pos="8640"/>
-              </w:tabs>
-              <w:spacing w:after="40" w:before="240" w:lineRule="auto"/>
-              <w:ind w:left="0" w:firstLine="0"/>
-              <w:rPr>
+              <w:keepLines w:val="0"/>
+              <w:pageBreakBefore w:val="0"/>
+              <w:widowControl w:val="1"/>
+              <w:pBdr>
+                <w:top w:space="0" w:sz="0" w:val="nil"/>
+                <w:left w:space="0" w:sz="0" w:val="nil"/>
+                <w:bottom w:space="0" w:sz="0" w:val="nil"/>
+                <w:right w:space="0" w:sz="0" w:val="nil"/>
+                <w:between w:space="0" w:sz="0" w:val="nil"/>
+              </w:pBdr>
+              <w:shd w:fill="auto" w:val="clear"/>
+              <w:tabs>
+                <w:tab w:val="center" w:leader="none" w:pos="4320"/>
+                <w:tab w:val="right" w:leader="none" w:pos="8640"/>
+              </w:tabs>
+              <w:spacing w:after="40" w:before="240" w:line="240" w:lineRule="auto"/>
+              <w:ind w:left="0" w:right="0" w:firstLine="0"/>
+              <w:jc w:val="left"/>
+              <w:rPr>
+                <w:rFonts w:ascii="Arial" w:cs="Arial" w:eastAsia="Arial" w:hAnsi="Arial"/>
+                <w:b w:val="0"/>
+                <w:bCs w:val="0"/>
                 <w:i w:val="0"/>
+                <w:iCs w:val="0"/>
+                <w:smallCaps w:val="0"/>
+                <w:strike w:val="0"/>
+                <w:color w:val="000000"/>
+                <w:sz w:val="18"/>
+                <w:szCs w:val="18"/>
+                <w:u w:val="none"/>
+                <w:shd w:fill="auto" w:val="clear"/>
+                <w:vertAlign w:val="baseline"/>
               </w:rPr>
             </w:pPr>
             <w:bookmarkStart w:colFirst="0" w:colLast="0" w:name="_heading=h.43bipw8fvmz9" w:id="8"/>
             <w:bookmarkEnd w:id="8"/>
             <w:r>
               <w:rPr>
+                <w:rFonts w:ascii="Arial" w:cs="Arial" w:eastAsia="Arial" w:hAnsi="Arial"/>
+                <w:b w:val="0"/>
+                <w:bCs w:val="0"/>
                 <w:i w:val="0"/>
-                <w:rtl w:val="0"/>
-              </w:rPr>
-              <w:t xml:space="preserve">       </w:t>
-            </w:r>
-            <w:r>
-              <w:rPr>
-                <w:i w:val="0"/>
-                <w:rtl w:val="0"/>
-              </w:rPr>
-              <w:t xml:space="preserve">2. Seguridad</w:t>
+                <w:iCs w:val="0"/>
+                <w:smallCaps w:val="0"/>
+                <w:strike w:val="0"/>
+                <w:color w:val="000000"/>
+                <w:sz w:val="18"/>
+                <w:szCs w:val="18"/>
+                <w:u w:val="none"/>
+                <w:shd w:fill="auto" w:val="clear"/>
+                <w:vertAlign w:val="baseline"/>
+                <w:rtl w:val="0"/>
+              </w:rPr>
+              <w:t xml:space="preserve">       2. Seguridad</w:t>
             </w:r>
           </w:p>
           <w:p>
             <w:pPr>
               <w:numPr>
                 <w:ilvl w:val="0"/>
-                <w:numId w:val="8"/>
+                <w:numId w:val="9"/>
               </w:numPr>
               <w:tabs>
                 <w:tab w:val="center" w:leader="none" w:pos="4320"/>
                 <w:tab w:val="right" w:leader="none" w:pos="8640"/>
               </w:tabs>
-              <w:spacing w:after="0" w:afterAutospacing="0" w:before="240" w:lineRule="auto"/>
+              <w:spacing w:after="0" w:before="240" w:lineRule="auto"/>
               <w:ind w:left="720" w:hanging="360"/>
               <w:rPr>
                 <w:sz w:val="18"/>
@@ -2067,32 +2693,34 @@
             </w:pPr>
             <w:r>
               <w:rPr>
-                <w:sz w:val="18"/>
-                <w:szCs w:val="18"/>
-                <w:rtl w:val="0"/>
-              </w:rPr>
-              <w:t xml:space="preserve">RNF03</w:t>
-            </w:r>
-            <w:r>
-              <w:rPr>
-                <w:sz w:val="18"/>
-                <w:szCs w:val="18"/>
-                <w:rtl w:val="0"/>
-              </w:rPr>
-              <w:t xml:space="preserve">: El sistema debe encriptar la información sensible de los clientes y las órdenes de trabajo utilizando el protocolo HTTPS.</w:t>
+                <w:b w:val="1"/>
+                <w:bCs w:val="1"/>
+                <w:sz w:val="18"/>
+                <w:szCs w:val="18"/>
+                <w:rtl w:val="0"/>
+              </w:rPr>
+              <w:t xml:space="preserve">RNF03:</w:t>
+            </w:r>
+            <w:r>
+              <w:rPr>
+                <w:sz w:val="18"/>
+                <w:szCs w:val="18"/>
+                <w:rtl w:val="0"/>
+              </w:rPr>
+              <w:t xml:space="preserve"> El sistema debe usar HTTPS para proteger la información. </w:t>
             </w:r>
           </w:p>
           <w:p>
             <w:pPr>
               <w:numPr>
                 <w:ilvl w:val="0"/>
-                <w:numId w:val="8"/>
+                <w:numId w:val="9"/>
               </w:numPr>
               <w:tabs>
                 <w:tab w:val="center" w:leader="none" w:pos="4320"/>
                 <w:tab w:val="right" w:leader="none" w:pos="8640"/>
               </w:tabs>
-              <w:spacing w:after="240" w:before="0" w:beforeAutospacing="0" w:lineRule="auto"/>
+              <w:spacing w:after="240" w:before="0" w:lineRule="auto"/>
               <w:ind w:left="720" w:hanging="360"/>
               <w:rPr>
                 <w:sz w:val="18"/>
@@ -2101,57 +2729,87 @@
             </w:pPr>
             <w:r>
               <w:rPr>
-                <w:sz w:val="18"/>
-                <w:szCs w:val="18"/>
-                <w:rtl w:val="0"/>
-              </w:rPr>
-              <w:t xml:space="preserve">RNF04</w:t>
-            </w:r>
-            <w:r>
-              <w:rPr>
-                <w:sz w:val="18"/>
-                <w:szCs w:val="18"/>
-                <w:rtl w:val="0"/>
-              </w:rPr>
-              <w:t xml:space="preserve">: Solo los administradores, trabajadores y supervisores deben tener acceso a la información de las órdenes de trabajo.</w:t>
-            </w:r>
-          </w:p>
-          <w:p>
-            <w:pPr>
-              <w:pStyle w:val="Heading4"/>
+                <w:b w:val="1"/>
+                <w:bCs w:val="1"/>
+                <w:sz w:val="18"/>
+                <w:szCs w:val="18"/>
+                <w:rtl w:val="0"/>
+              </w:rPr>
+              <w:t xml:space="preserve">RNF04:</w:t>
+            </w:r>
+            <w:r>
+              <w:rPr>
+                <w:sz w:val="18"/>
+                <w:szCs w:val="18"/>
+                <w:rtl w:val="0"/>
+              </w:rPr>
+              <w:t xml:space="preserve"> El acceso debe estar controlado por roles. </w:t>
+            </w:r>
+          </w:p>
+          <w:p>
+            <w:pPr>
               <w:keepNext w:val="0"/>
-              <w:tabs>
-                <w:tab w:val="center" w:leader="none" w:pos="4320"/>
-                <w:tab w:val="right" w:leader="none" w:pos="8640"/>
-              </w:tabs>
-              <w:spacing w:after="40" w:before="240" w:lineRule="auto"/>
-              <w:ind w:left="0" w:firstLine="0"/>
-              <w:rPr>
+              <w:keepLines w:val="0"/>
+              <w:pageBreakBefore w:val="0"/>
+              <w:widowControl w:val="1"/>
+              <w:pBdr>
+                <w:top w:space="0" w:sz="0" w:val="nil"/>
+                <w:left w:space="0" w:sz="0" w:val="nil"/>
+                <w:bottom w:space="0" w:sz="0" w:val="nil"/>
+                <w:right w:space="0" w:sz="0" w:val="nil"/>
+                <w:between w:space="0" w:sz="0" w:val="nil"/>
+              </w:pBdr>
+              <w:shd w:fill="auto" w:val="clear"/>
+              <w:tabs>
+                <w:tab w:val="center" w:leader="none" w:pos="4320"/>
+                <w:tab w:val="right" w:leader="none" w:pos="8640"/>
+              </w:tabs>
+              <w:spacing w:after="40" w:before="240" w:line="240" w:lineRule="auto"/>
+              <w:ind w:left="0" w:right="0" w:firstLine="0"/>
+              <w:jc w:val="left"/>
+              <w:rPr>
+                <w:rFonts w:ascii="Arial" w:cs="Arial" w:eastAsia="Arial" w:hAnsi="Arial"/>
+                <w:b w:val="0"/>
+                <w:bCs w:val="0"/>
                 <w:i w:val="0"/>
+                <w:iCs w:val="0"/>
+                <w:smallCaps w:val="0"/>
+                <w:strike w:val="0"/>
+                <w:color w:val="000000"/>
+                <w:sz w:val="18"/>
+                <w:szCs w:val="18"/>
+                <w:u w:val="none"/>
+                <w:shd w:fill="auto" w:val="clear"/>
+                <w:vertAlign w:val="baseline"/>
               </w:rPr>
             </w:pPr>
             <w:bookmarkStart w:colFirst="0" w:colLast="0" w:name="_heading=h.3jwv9dlelw1v" w:id="9"/>
             <w:bookmarkEnd w:id="9"/>
             <w:r>
               <w:rPr>
+                <w:rFonts w:ascii="Arial" w:cs="Arial" w:eastAsia="Arial" w:hAnsi="Arial"/>
+                <w:b w:val="0"/>
+                <w:bCs w:val="0"/>
                 <w:i w:val="0"/>
-                <w:rtl w:val="0"/>
-              </w:rPr>
-              <w:t xml:space="preserve">       </w:t>
-            </w:r>
-            <w:r>
-              <w:rPr>
-                <w:i w:val="0"/>
-                <w:rtl w:val="0"/>
-              </w:rPr>
-              <w:t xml:space="preserve">3. Usabilidad</w:t>
+                <w:iCs w:val="0"/>
+                <w:smallCaps w:val="0"/>
+                <w:strike w:val="0"/>
+                <w:color w:val="000000"/>
+                <w:sz w:val="18"/>
+                <w:szCs w:val="18"/>
+                <w:u w:val="none"/>
+                <w:shd w:fill="auto" w:val="clear"/>
+                <w:vertAlign w:val="baseline"/>
+                <w:rtl w:val="0"/>
+              </w:rPr>
+              <w:t xml:space="preserve">       3. Usabilidad</w:t>
             </w:r>
           </w:p>
           <w:p>
             <w:pPr>
               <w:numPr>
                 <w:ilvl w:val="0"/>
-                <w:numId w:val="6"/>
+                <w:numId w:val="7"/>
               </w:numPr>
               <w:tabs>
                 <w:tab w:val="center" w:leader="none" w:pos="4320"/>
@@ -2166,57 +2824,87 @@
             </w:pPr>
             <w:r>
               <w:rPr>
-                <w:sz w:val="18"/>
-                <w:szCs w:val="18"/>
-                <w:rtl w:val="0"/>
-              </w:rPr>
-              <w:t xml:space="preserve">RNF05</w:t>
-            </w:r>
-            <w:r>
-              <w:rPr>
-                <w:sz w:val="18"/>
-                <w:szCs w:val="18"/>
-                <w:rtl w:val="0"/>
-              </w:rPr>
-              <w:t xml:space="preserve">: La interfaz debe ser intuitiva y fácil de usar, permitiendo que los empleados del taller, con conocimientos básicos de informática, puedan operar el sistema sin necesidad de capacitación avanzada.</w:t>
-            </w:r>
-          </w:p>
-          <w:p>
-            <w:pPr>
-              <w:pStyle w:val="Heading4"/>
+                <w:b w:val="1"/>
+                <w:bCs w:val="1"/>
+                <w:sz w:val="18"/>
+                <w:szCs w:val="18"/>
+                <w:rtl w:val="0"/>
+              </w:rPr>
+              <w:t xml:space="preserve">RNF05:</w:t>
+            </w:r>
+            <w:r>
+              <w:rPr>
+                <w:sz w:val="18"/>
+                <w:szCs w:val="18"/>
+                <w:rtl w:val="0"/>
+              </w:rPr>
+              <w:t xml:space="preserve"> La interfaz debe ser intuitiva y fácil de usar. </w:t>
+            </w:r>
+          </w:p>
+          <w:p>
+            <w:pPr>
               <w:keepNext w:val="0"/>
-              <w:tabs>
-                <w:tab w:val="center" w:leader="none" w:pos="4320"/>
-                <w:tab w:val="right" w:leader="none" w:pos="8640"/>
-              </w:tabs>
-              <w:spacing w:after="40" w:before="240" w:lineRule="auto"/>
-              <w:ind w:left="0" w:firstLine="0"/>
-              <w:rPr>
+              <w:keepLines w:val="0"/>
+              <w:pageBreakBefore w:val="0"/>
+              <w:widowControl w:val="1"/>
+              <w:pBdr>
+                <w:top w:space="0" w:sz="0" w:val="nil"/>
+                <w:left w:space="0" w:sz="0" w:val="nil"/>
+                <w:bottom w:space="0" w:sz="0" w:val="nil"/>
+                <w:right w:space="0" w:sz="0" w:val="nil"/>
+                <w:between w:space="0" w:sz="0" w:val="nil"/>
+              </w:pBdr>
+              <w:shd w:fill="auto" w:val="clear"/>
+              <w:tabs>
+                <w:tab w:val="center" w:leader="none" w:pos="4320"/>
+                <w:tab w:val="right" w:leader="none" w:pos="8640"/>
+              </w:tabs>
+              <w:spacing w:after="40" w:before="240" w:line="240" w:lineRule="auto"/>
+              <w:ind w:left="0" w:right="0" w:firstLine="0"/>
+              <w:jc w:val="left"/>
+              <w:rPr>
+                <w:rFonts w:ascii="Arial" w:cs="Arial" w:eastAsia="Arial" w:hAnsi="Arial"/>
+                <w:b w:val="0"/>
+                <w:bCs w:val="0"/>
                 <w:i w:val="0"/>
+                <w:iCs w:val="0"/>
+                <w:smallCaps w:val="0"/>
+                <w:strike w:val="0"/>
+                <w:color w:val="000000"/>
+                <w:sz w:val="18"/>
+                <w:szCs w:val="18"/>
+                <w:u w:val="none"/>
+                <w:shd w:fill="auto" w:val="clear"/>
+                <w:vertAlign w:val="baseline"/>
               </w:rPr>
             </w:pPr>
             <w:bookmarkStart w:colFirst="0" w:colLast="0" w:name="_heading=h.66wvvyxa5zpl" w:id="10"/>
             <w:bookmarkEnd w:id="10"/>
             <w:r>
               <w:rPr>
+                <w:rFonts w:ascii="Arial" w:cs="Arial" w:eastAsia="Arial" w:hAnsi="Arial"/>
+                <w:b w:val="0"/>
+                <w:bCs w:val="0"/>
                 <w:i w:val="0"/>
-                <w:rtl w:val="0"/>
-              </w:rPr>
-              <w:t xml:space="preserve">       </w:t>
-            </w:r>
-            <w:r>
-              <w:rPr>
-                <w:i w:val="0"/>
-                <w:rtl w:val="0"/>
-              </w:rPr>
-              <w:t xml:space="preserve">4. Escalabilidad</w:t>
+                <w:iCs w:val="0"/>
+                <w:smallCaps w:val="0"/>
+                <w:strike w:val="0"/>
+                <w:color w:val="000000"/>
+                <w:sz w:val="18"/>
+                <w:szCs w:val="18"/>
+                <w:u w:val="none"/>
+                <w:shd w:fill="auto" w:val="clear"/>
+                <w:vertAlign w:val="baseline"/>
+                <w:rtl w:val="0"/>
+              </w:rPr>
+              <w:t xml:space="preserve">       4. Escalabilidad</w:t>
             </w:r>
           </w:p>
           <w:p>
             <w:pPr>
               <w:numPr>
                 <w:ilvl w:val="0"/>
-                <w:numId w:val="1"/>
+                <w:numId w:val="2"/>
               </w:numPr>
               <w:tabs>
                 <w:tab w:val="center" w:leader="none" w:pos="4320"/>
@@ -2231,19 +2919,21 @@
             </w:pPr>
             <w:r>
               <w:rPr>
-                <w:sz w:val="18"/>
-                <w:szCs w:val="18"/>
-                <w:rtl w:val="0"/>
-              </w:rPr>
-              <w:t xml:space="preserve">RNF06</w:t>
-            </w:r>
-            <w:r>
-              <w:rPr>
-                <w:sz w:val="18"/>
-                <w:szCs w:val="18"/>
-                <w:rtl w:val="0"/>
-              </w:rPr>
-              <w:t xml:space="preserve">: El sistema debe ser escalable para permitir la adición de más talleres en el futuro sin comprometer el rendimiento.</w:t>
+                <w:b w:val="1"/>
+                <w:bCs w:val="1"/>
+                <w:sz w:val="18"/>
+                <w:szCs w:val="18"/>
+                <w:rtl w:val="0"/>
+              </w:rPr>
+              <w:t xml:space="preserve">RNF06:</w:t>
+            </w:r>
+            <w:r>
+              <w:rPr>
+                <w:sz w:val="18"/>
+                <w:szCs w:val="18"/>
+                <w:rtl w:val="0"/>
+              </w:rPr>
+              <w:t xml:space="preserve"> El sistema debe permitir agregar nuevos módulos sin afectar el rendimiento. </w:t>
             </w:r>
           </w:p>
           <w:p>
@@ -2409,14 +3099,16 @@
               <w:jc w:val="both"/>
               <w:rPr>
                 <w:b w:val="1"/>
-                <w:color w:val="000000"/>
-                <w:sz w:val="18"/>
-                <w:szCs w:val="18"/>
-              </w:rPr>
-            </w:pPr>
-            <w:r>
-              <w:rPr>
-                <w:b w:val="1"/>
+                <w:bCs w:val="1"/>
+                <w:color w:val="000000"/>
+                <w:sz w:val="18"/>
+                <w:szCs w:val="18"/>
+              </w:rPr>
+            </w:pPr>
+            <w:r>
+              <w:rPr>
+                <w:b w:val="1"/>
+                <w:bCs w:val="1"/>
                 <w:color w:val="000000"/>
                 <w:sz w:val="18"/>
                 <w:szCs w:val="18"/>
@@ -2472,34 +3164,33 @@
             <w:pPr>
               <w:numPr>
                 <w:ilvl w:val="0"/>
-                <w:numId w:val="5"/>
+                <w:numId w:val="6"/>
               </w:numPr>
               <w:tabs>
                 <w:tab w:val="center" w:leader="none" w:pos="4320"/>
                 <w:tab w:val="right" w:leader="none" w:pos="8640"/>
               </w:tabs>
-              <w:spacing w:after="0" w:afterAutospacing="0" w:lineRule="auto"/>
+              <w:spacing w:after="60" w:lineRule="auto"/>
               <w:ind w:left="720" w:hanging="360"/>
               <w:rPr>
                 <w:sz w:val="18"/>
                 <w:szCs w:val="18"/>
-                <w:u w:val="none"/>
-              </w:rPr>
-            </w:pPr>
-            <w:r>
-              <w:rPr>
-                <w:sz w:val="18"/>
-                <w:szCs w:val="18"/>
-                <w:rtl w:val="0"/>
-              </w:rPr>
-              <w:t xml:space="preserve">Se asume que todos los talleres que utilizarán el sistema contarán con conexión a internet.</w:t>
+              </w:rPr>
+            </w:pPr>
+            <w:r>
+              <w:rPr>
+                <w:sz w:val="18"/>
+                <w:szCs w:val="18"/>
+                <w:rtl w:val="0"/>
+              </w:rPr>
+              <w:t xml:space="preserve">Los usuarios tendrán acceso a internet</w:t>
             </w:r>
           </w:p>
           <w:p>
             <w:pPr>
               <w:numPr>
                 <w:ilvl w:val="0"/>
-                <w:numId w:val="5"/>
+                <w:numId w:val="6"/>
               </w:numPr>
               <w:tabs>
                 <w:tab w:val="center" w:leader="none" w:pos="4320"/>
@@ -2510,16 +3201,72 @@
               <w:rPr>
                 <w:sz w:val="18"/>
                 <w:szCs w:val="18"/>
-                <w:u w:val="none"/>
-              </w:rPr>
-            </w:pPr>
-            <w:r>
-              <w:rPr>
-                <w:sz w:val="18"/>
-                <w:szCs w:val="18"/>
-                <w:rtl w:val="0"/>
-              </w:rPr>
-              <w:t xml:space="preserve">La base de datos de clientes y vehículos dependerá de la información previamente ingresada por los talleres.</w:t>
+              </w:rPr>
+            </w:pPr>
+            <w:r>
+              <w:rPr>
+                <w:sz w:val="18"/>
+                <w:szCs w:val="18"/>
+                <w:rtl w:val="0"/>
+              </w:rPr>
+              <w:t xml:space="preserve">El sistema dependerá de una base de datos PostgreSQL</w:t>
+            </w:r>
+          </w:p>
+          <w:p>
+            <w:pPr>
+              <w:numPr>
+                <w:ilvl w:val="0"/>
+                <w:numId w:val="6"/>
+              </w:numPr>
+              <w:tabs>
+                <w:tab w:val="center" w:leader="none" w:pos="4320"/>
+                <w:tab w:val="right" w:leader="none" w:pos="8640"/>
+              </w:tabs>
+              <w:spacing w:after="60" w:lineRule="auto"/>
+              <w:ind w:left="720" w:hanging="360"/>
+              <w:rPr>
+                <w:sz w:val="18"/>
+                <w:szCs w:val="18"/>
+              </w:rPr>
+            </w:pPr>
+            <w:r>
+              <w:rPr>
+                <w:sz w:val="18"/>
+                <w:szCs w:val="18"/>
+                <w:rtl w:val="0"/>
+              </w:rPr>
+              <w:t xml:space="preserve">El backend será desarrollado en Node.js</w:t>
+            </w:r>
+          </w:p>
+          <w:p>
+            <w:pPr>
+              <w:numPr>
+                <w:ilvl w:val="0"/>
+                <w:numId w:val="6"/>
+              </w:numPr>
+              <w:tabs>
+                <w:tab w:val="center" w:leader="none" w:pos="4320"/>
+                <w:tab w:val="right" w:leader="none" w:pos="8640"/>
+              </w:tabs>
+              <w:spacing w:after="60" w:lineRule="auto"/>
+              <w:ind w:left="720" w:hanging="360"/>
+              <w:rPr>
+                <w:sz w:val="18"/>
+                <w:szCs w:val="18"/>
+              </w:rPr>
+            </w:pPr>
+            <w:r>
+              <w:rPr>
+                <w:sz w:val="18"/>
+                <w:szCs w:val="18"/>
+                <w:rtl w:val="0"/>
+              </w:rPr>
+              <w:t xml:space="preserve">El frontend será desarrollado en Angular.</w:t>
+            </w:r>
+            <w:r>
+              <w:rPr>
+                <w:rtl w:val="0"/>
+              </w:rPr>
             </w:r>
           </w:p>
           <w:p>
@@ -2654,6 +3401,7 @@
               <w:spacing w:after="60" w:before="60" w:lineRule="auto"/>
               <w:rPr>
                 <w:b w:val="1"/>
+                <w:bCs w:val="1"/>
                 <w:color w:val="000000"/>
                 <w:sz w:val="26"/>
                 <w:szCs w:val="26"/>
@@ -2662,6 +3410,7 @@
             <w:r>
               <w:rPr>
                 <w:b w:val="1"/>
+                <w:bCs w:val="1"/>
                 <w:color w:val="000000"/>
                 <w:sz w:val="26"/>
                 <w:szCs w:val="26"/>
@@ -2698,14 +3447,16 @@
               <w:spacing w:after="60" w:before="60" w:lineRule="auto"/>
               <w:rPr>
                 <w:b w:val="1"/>
-                <w:color w:val="000000"/>
-                <w:sz w:val="18"/>
-                <w:szCs w:val="18"/>
-              </w:rPr>
-            </w:pPr>
-            <w:r>
-              <w:rPr>
-                <w:b w:val="1"/>
+                <w:bCs w:val="1"/>
+                <w:color w:val="000000"/>
+                <w:sz w:val="18"/>
+                <w:szCs w:val="18"/>
+              </w:rPr>
+            </w:pPr>
+            <w:r>
+              <w:rPr>
+                <w:b w:val="1"/>
+                <w:bCs w:val="1"/>
                 <w:color w:val="000000"/>
                 <w:sz w:val="18"/>
                 <w:szCs w:val="18"/>
@@ -2736,14 +3487,16 @@
               <w:spacing w:after="60" w:before="60" w:lineRule="auto"/>
               <w:rPr>
                 <w:b w:val="1"/>
-                <w:color w:val="000000"/>
-                <w:sz w:val="18"/>
-                <w:szCs w:val="18"/>
-              </w:rPr>
-            </w:pPr>
-            <w:r>
-              <w:rPr>
-                <w:b w:val="1"/>
+                <w:bCs w:val="1"/>
+                <w:color w:val="000000"/>
+                <w:sz w:val="18"/>
+                <w:szCs w:val="18"/>
+              </w:rPr>
+            </w:pPr>
+            <w:r>
+              <w:rPr>
+                <w:b w:val="1"/>
+                <w:bCs w:val="1"/>
                 <w:color w:val="000000"/>
                 <w:sz w:val="18"/>
                 <w:szCs w:val="18"/>
@@ -2774,14 +3527,16 @@
               <w:spacing w:after="60" w:before="60" w:lineRule="auto"/>
               <w:rPr>
                 <w:b w:val="1"/>
-                <w:color w:val="000000"/>
-                <w:sz w:val="18"/>
-                <w:szCs w:val="18"/>
-              </w:rPr>
-            </w:pPr>
-            <w:r>
-              <w:rPr>
-                <w:b w:val="1"/>
+                <w:bCs w:val="1"/>
+                <w:color w:val="000000"/>
+                <w:sz w:val="18"/>
+                <w:szCs w:val="18"/>
+              </w:rPr>
+            </w:pPr>
+            <w:r>
+              <w:rPr>
+                <w:b w:val="1"/>
+                <w:bCs w:val="1"/>
                 <w:color w:val="000000"/>
                 <w:sz w:val="18"/>
                 <w:szCs w:val="18"/>
@@ -2813,14 +3568,16 @@
               <w:jc w:val="center"/>
               <w:rPr>
                 <w:b w:val="1"/>
-                <w:color w:val="000000"/>
-                <w:sz w:val="18"/>
-                <w:szCs w:val="18"/>
-              </w:rPr>
-            </w:pPr>
-            <w:r>
-              <w:rPr>
-                <w:b w:val="1"/>
+                <w:bCs w:val="1"/>
+                <w:color w:val="000000"/>
+                <w:sz w:val="18"/>
+                <w:szCs w:val="18"/>
+              </w:rPr>
+            </w:pPr>
+            <w:r>
+              <w:rPr>
+                <w:b w:val="1"/>
+                <w:bCs w:val="1"/>
                 <w:color w:val="000000"/>
                 <w:sz w:val="18"/>
                 <w:szCs w:val="18"/>
@@ -2857,14 +3614,16 @@
               <w:spacing w:after="60" w:before="60" w:lineRule="auto"/>
               <w:rPr>
                 <w:b w:val="1"/>
-                <w:color w:val="000000"/>
-                <w:sz w:val="18"/>
-                <w:szCs w:val="18"/>
-              </w:rPr>
-            </w:pPr>
-            <w:r>
-              <w:rPr>
-                <w:b w:val="1"/>
+                <w:bCs w:val="1"/>
+                <w:color w:val="000000"/>
+                <w:sz w:val="18"/>
+                <w:szCs w:val="18"/>
+              </w:rPr>
+            </w:pPr>
+            <w:r>
+              <w:rPr>
+                <w:b w:val="1"/>
+                <w:bCs w:val="1"/>
                 <w:sz w:val="18"/>
                 <w:szCs w:val="18"/>
                 <w:rtl w:val="0"/>
@@ -2874,6 +3633,7 @@
             <w:r>
               <w:rPr>
                 <w:b w:val="1"/>
+                <w:bCs w:val="1"/>
                 <w:color w:val="000000"/>
                 <w:sz w:val="18"/>
                 <w:szCs w:val="18"/>
@@ -2892,13 +3652,6 @@
           </w:tcPr>
           <w:p>
             <w:pPr>
-              <w:pBdr>
-                <w:top w:space="0" w:sz="0" w:val="nil"/>
-                <w:left w:space="0" w:sz="0" w:val="nil"/>
-                <w:bottom w:space="0" w:sz="0" w:val="nil"/>
-                <w:right w:space="0" w:sz="0" w:val="nil"/>
-                <w:between w:space="0" w:sz="0" w:val="nil"/>
-              </w:pBdr>
               <w:tabs>
                 <w:tab w:val="center" w:leader="none" w:pos="4320"/>
                 <w:tab w:val="right" w:leader="none" w:pos="8640"/>
@@ -2916,7 +3669,7 @@
                 <w:szCs w:val="18"/>
                 <w:rtl w:val="0"/>
               </w:rPr>
-              <w:t xml:space="preserve">Fabian Olate</w:t>
+              <w:t xml:space="preserve">Ignacio Pinares</w:t>
             </w:r>
             <w:r>
               <w:rPr>
@@ -2948,7 +3701,9 @@
               <w:spacing w:after="60" w:before="60" w:lineRule="auto"/>
               <w:rPr>
                 <w:b w:val="1"/>
+                <w:bCs w:val="1"/>
                 <w:i w:val="1"/>
+                <w:iCs w:val="1"/>
                 <w:color w:val="000000"/>
                 <w:sz w:val="18"/>
                 <w:szCs w:val="18"/>
@@ -3015,14 +3770,16 @@
               <w:spacing w:after="60" w:before="60" w:lineRule="auto"/>
               <w:rPr>
                 <w:b w:val="1"/>
-                <w:color w:val="000000"/>
-                <w:sz w:val="18"/>
-                <w:szCs w:val="18"/>
-              </w:rPr>
-            </w:pPr>
-            <w:r>
-              <w:rPr>
-                <w:b w:val="1"/>
+                <w:bCs w:val="1"/>
+                <w:color w:val="000000"/>
+                <w:sz w:val="18"/>
+                <w:szCs w:val="18"/>
+              </w:rPr>
+            </w:pPr>
+            <w:r>
+              <w:rPr>
+                <w:b w:val="1"/>
+                <w:bCs w:val="1"/>
                 <w:sz w:val="18"/>
                 <w:szCs w:val="18"/>
                 <w:rtl w:val="0"/>
@@ -3069,7 +3826,7 @@
                 <w:szCs w:val="18"/>
                 <w:rtl w:val="0"/>
               </w:rPr>
-              <w:t xml:space="preserve">Ignacio Pinares</w:t>
+              <w:t xml:space="preserve">Diego de la Sota</w:t>
             </w:r>
             <w:r>
               <w:rPr>
@@ -3101,7 +3858,154 @@
               <w:spacing w:after="60" w:before="60" w:lineRule="auto"/>
               <w:rPr>
                 <w:b w:val="1"/>
+                <w:bCs w:val="1"/>
                 <w:i w:val="1"/>
+                <w:iCs w:val="1"/>
+                <w:color w:val="000000"/>
+                <w:sz w:val="18"/>
+                <w:szCs w:val="18"/>
+              </w:rPr>
+            </w:pPr>
+            <w:r>
+              <w:rPr>
+                <w:rtl w:val="0"/>
+              </w:rPr>
+            </w:r>
+          </w:p>
+        </w:tc>
+        <w:tc>
+          <w:tcPr>
+            <w:tcMar>
+              <w:top w:w="0.0" w:type="dxa"/>
+              <w:bottom w:w="0.0" w:type="dxa"/>
+            </w:tcMar>
+          </w:tcPr>
+          <w:p>
+            <w:pPr>
+              <w:pBdr>
+                <w:top w:space="0" w:sz="0" w:val="nil"/>
+                <w:left w:space="0" w:sz="0" w:val="nil"/>
+                <w:bottom w:space="0" w:sz="0" w:val="nil"/>
+                <w:right w:space="0" w:sz="0" w:val="nil"/>
+                <w:between w:space="0" w:sz="0" w:val="nil"/>
+              </w:pBdr>
+              <w:tabs>
+                <w:tab w:val="center" w:leader="none" w:pos="4320"/>
+                <w:tab w:val="right" w:leader="none" w:pos="8640"/>
+              </w:tabs>
+              <w:spacing w:after="60" w:before="60" w:lineRule="auto"/>
+              <w:rPr>
+                <w:color w:val="000000"/>
+                <w:sz w:val="18"/>
+                <w:szCs w:val="18"/>
+              </w:rPr>
+            </w:pPr>
+            <w:r>
+              <w:rPr>
+                <w:rtl w:val="0"/>
+              </w:rPr>
+            </w:r>
+          </w:p>
+        </w:tc>
+      </w:tr>
+      <w:tr>
+        <w:trPr>
+          <w:cantSplit w:val="0"/>
+          <w:tblHeader w:val="0"/>
+        </w:trPr>
+        <w:tc>
+          <w:tcPr>
+            <w:shd w:fill="f2f2f2" w:val="clear"/>
+            <w:tcMar>
+              <w:top w:w="0.0" w:type="dxa"/>
+              <w:bottom w:w="0.0" w:type="dxa"/>
+            </w:tcMar>
+          </w:tcPr>
+          <w:p>
+            <w:pPr>
+              <w:keepNext w:val="1"/>
+              <w:spacing w:after="60" w:before="60" w:lineRule="auto"/>
+              <w:rPr>
+                <w:b w:val="1"/>
+                <w:bCs w:val="1"/>
+                <w:sz w:val="18"/>
+                <w:szCs w:val="18"/>
+              </w:rPr>
+            </w:pPr>
+            <w:r>
+              <w:rPr>
+                <w:b w:val="1"/>
+                <w:bCs w:val="1"/>
+                <w:sz w:val="18"/>
+                <w:szCs w:val="18"/>
+                <w:rtl w:val="0"/>
+              </w:rPr>
+              <w:t xml:space="preserve">Desarrollador</w:t>
+            </w:r>
+          </w:p>
+        </w:tc>
+        <w:tc>
+          <w:tcPr>
+            <w:tcMar>
+              <w:top w:w="0.0" w:type="dxa"/>
+              <w:bottom w:w="0.0" w:type="dxa"/>
+            </w:tcMar>
+          </w:tcPr>
+          <w:p>
+            <w:pPr>
+              <w:pBdr>
+                <w:top w:space="0" w:sz="0" w:val="nil"/>
+                <w:left w:space="0" w:sz="0" w:val="nil"/>
+                <w:bottom w:space="0" w:sz="0" w:val="nil"/>
+                <w:right w:space="0" w:sz="0" w:val="nil"/>
+                <w:between w:space="0" w:sz="0" w:val="nil"/>
+              </w:pBdr>
+              <w:tabs>
+                <w:tab w:val="center" w:leader="none" w:pos="4320"/>
+                <w:tab w:val="right" w:leader="none" w:pos="8640"/>
+              </w:tabs>
+              <w:spacing w:after="60" w:before="60" w:lineRule="auto"/>
+              <w:rPr>
+                <w:sz w:val="18"/>
+                <w:szCs w:val="18"/>
+              </w:rPr>
+            </w:pPr>
+            <w:r>
+              <w:rPr>
+                <w:sz w:val="18"/>
+                <w:szCs w:val="18"/>
+                <w:rtl w:val="0"/>
+              </w:rPr>
+              <w:t xml:space="preserve">Luis Salamanca</w:t>
+            </w:r>
+          </w:p>
+        </w:tc>
+        <w:tc>
+          <w:tcPr>
+            <w:tcMar>
+              <w:top w:w="0.0" w:type="dxa"/>
+              <w:bottom w:w="0.0" w:type="dxa"/>
+            </w:tcMar>
+          </w:tcPr>
+          <w:p>
+            <w:pPr>
+              <w:pBdr>
+                <w:top w:space="0" w:sz="0" w:val="nil"/>
+                <w:left w:space="0" w:sz="0" w:val="nil"/>
+                <w:bottom w:space="0" w:sz="0" w:val="nil"/>
+                <w:right w:space="0" w:sz="0" w:val="nil"/>
+                <w:between w:space="0" w:sz="0" w:val="nil"/>
+              </w:pBdr>
+              <w:tabs>
+                <w:tab w:val="center" w:leader="none" w:pos="4320"/>
+                <w:tab w:val="right" w:leader="none" w:pos="8640"/>
+              </w:tabs>
+              <w:spacing w:after="60" w:before="60" w:lineRule="auto"/>
+              <w:rPr>
+                <w:b w:val="1"/>
+                <w:bCs w:val="1"/>
+                <w:i w:val="1"/>
+                <w:iCs w:val="1"/>
                 <w:color w:val="000000"/>
                 <w:sz w:val="18"/>
                 <w:szCs w:val="18"/>
@@ -3163,6 +4067,7 @@
         <w:jc w:val="both"/>
         <w:rPr>
           <w:b w:val="1"/>
+          <w:bCs w:val="1"/>
           <w:color w:val="000000"/>
           <w:sz w:val="18"/>
           <w:szCs w:val="18"/>
@@ -3202,6 +4107,7 @@
       <w:spacing w:line="276" w:lineRule="auto"/>
       <w:rPr>
         <w:b w:val="1"/>
+        <w:bCs w:val="1"/>
         <w:color w:val="000000"/>
         <w:sz w:val="18"/>
         <w:szCs w:val="18"/>
@@ -3263,6 +4169,7 @@
             <w:spacing w:before="60" w:lineRule="auto"/>
             <w:rPr>
               <w:i w:val="1"/>
+              <w:iCs w:val="1"/>
               <w:color w:val="000000"/>
               <w:sz w:val="18"/>
               <w:szCs w:val="18"/>
@@ -3294,6 +4201,7 @@
           <w:r>
             <w:rPr>
               <w:i w:val="1"/>
+              <w:iCs w:val="1"/>
               <w:sz w:val="18"/>
               <w:szCs w:val="18"/>
               <w:rtl w:val="0"/>
@@ -3303,6 +4211,7 @@
           <w:r>
             <w:rPr>
               <w:i w:val="1"/>
+              <w:iCs w:val="1"/>
               <w:sz w:val="18"/>
               <w:szCs w:val="18"/>
             </w:rPr>
@@ -3314,6 +4223,7 @@
           <w:r>
             <w:rPr>
               <w:i w:val="1"/>
+              <w:iCs w:val="1"/>
               <w:sz w:val="18"/>
               <w:szCs w:val="18"/>
               <w:rtl w:val="0"/>
@@ -3323,6 +4233,7 @@
           <w:r>
             <w:rPr>
               <w:i w:val="1"/>
+              <w:iCs w:val="1"/>
               <w:sz w:val="18"/>
               <w:szCs w:val="18"/>
             </w:rPr>
@@ -3463,6 +4374,7 @@
             </w:tabs>
             <w:rPr>
               <w:b w:val="1"/>
+              <w:bCs w:val="1"/>
               <w:color w:val="000000"/>
               <w:sz w:val="18"/>
               <w:szCs w:val="18"/>
@@ -3478,7 +4390,7 @@
               <wp:anchor allowOverlap="1" behindDoc="0" distB="0" distT="0" distL="114300" distR="114300" hidden="0" layoutInCell="1" locked="0" relativeHeight="0" simplePos="0">
                 <wp:simplePos x="0" y="0"/>
                 <wp:positionH relativeFrom="column">
-                  <wp:posOffset>-48889</wp:posOffset>
+                  <wp:posOffset>-48888</wp:posOffset>
                 </wp:positionH>
                 <wp:positionV relativeFrom="paragraph">
                   <wp:posOffset>7620</wp:posOffset>
@@ -3486,7 +4398,7 @@
                 <wp:extent cx="2018665" cy="659130"/>
                 <wp:effectExtent b="0" l="0" r="0" t="0"/>
                 <wp:wrapNone/>
-                <wp:docPr descr="Educación-Continua" id="7" name="image1.jpg"/>
+                <wp:docPr descr="Educación-Continua" id="1" name="image1.jpg"/>
                 <a:graphic>
                   <a:graphicData uri="http://schemas.openxmlformats.org/drawingml/2006/picture">
                     <pic:pic>
@@ -3538,6 +4450,7 @@
             <w:jc w:val="center"/>
             <w:rPr>
               <w:b w:val="1"/>
+              <w:bCs w:val="1"/>
               <w:color w:val="17365d"/>
               <w:sz w:val="28"/>
               <w:szCs w:val="28"/>
@@ -3546,6 +4459,7 @@
           <w:r>
             <w:rPr>
               <w:b w:val="1"/>
+              <w:bCs w:val="1"/>
               <w:color w:val="17365d"/>
               <w:sz w:val="28"/>
               <w:szCs w:val="28"/>
@@ -3574,6 +4488,7 @@
             </w:tabs>
             <w:rPr>
               <w:b w:val="1"/>
+              <w:bCs w:val="1"/>
               <w:color w:val="000000"/>
               <w:sz w:val="16"/>
               <w:szCs w:val="16"/>
@@ -3600,6 +4515,7 @@
             </w:tabs>
             <w:rPr>
               <w:b w:val="1"/>
+              <w:bCs w:val="1"/>
               <w:color w:val="000000"/>
               <w:sz w:val="18"/>
               <w:szCs w:val="18"/>
@@ -3629,6 +4545,7 @@
       </w:tabs>
       <w:rPr>
         <w:b w:val="1"/>
+        <w:bCs w:val="1"/>
         <w:color w:val="000000"/>
         <w:sz w:val="18"/>
         <w:szCs w:val="18"/>
@@ -4847,6 +5764,116 @@
       <w:numFmt w:val="bullet"/>
       <w:lvlText w:val="■"/>
       <w:lvlJc w:val="left"/>
+      <w:pPr>
+        <w:ind w:left="6480" w:hanging="360"/>
+      </w:pPr>
+      <w:rPr>
+        <w:u w:val="none"/>
+      </w:rPr>
+    </w:lvl>
+  </w:abstractNum>
+  <w:abstractNum w:abstractNumId="12">
+    <w:lvl w:ilvl="0">
+      <w:start w:val="1"/>
+      <w:numFmt w:val="decimal"/>
+      <w:lvlText w:val="%1."/>
+      <w:lvlJc w:val="left"/>
+      <w:pPr>
+        <w:ind w:left="720" w:hanging="360"/>
+      </w:pPr>
+      <w:rPr>
+        <w:u w:val="none"/>
+      </w:rPr>
+    </w:lvl>
+    <w:lvl w:ilvl="1">
+      <w:start w:val="1"/>
+      <w:numFmt w:val="lowerLetter"/>
+      <w:lvlText w:val="%2."/>
+      <w:lvlJc w:val="left"/>
+      <w:pPr>
+        <w:ind w:left="1440" w:hanging="360"/>
+      </w:pPr>
+      <w:rPr>
+        <w:u w:val="none"/>
+      </w:rPr>
+    </w:lvl>
+    <w:lvl w:ilvl="2">
+      <w:start w:val="1"/>
+      <w:numFmt w:val="lowerRoman"/>
+      <w:lvlText w:val="%3."/>
+      <w:lvlJc w:val="right"/>
+      <w:pPr>
+        <w:ind w:left="2160" w:hanging="360"/>
+      </w:pPr>
+      <w:rPr>
+        <w:u w:val="none"/>
+      </w:rPr>
+    </w:lvl>
+    <w:lvl w:ilvl="3">
+      <w:start w:val="1"/>
+      <w:numFmt w:val="decimal"/>
+      <w:lvlText w:val="%4."/>
+      <w:lvlJc w:val="left"/>
+      <w:pPr>
+        <w:ind w:left="2880" w:hanging="360"/>
+      </w:pPr>
+      <w:rPr>
+        <w:u w:val="none"/>
+      </w:rPr>
+    </w:lvl>
+    <w:lvl w:ilvl="4">
+      <w:start w:val="1"/>
+      <w:numFmt w:val="lowerLetter"/>
+      <w:lvlText w:val="%5."/>
+      <w:lvlJc w:val="left"/>
+      <w:pPr>
+        <w:ind w:left="3600" w:hanging="360"/>
+      </w:pPr>
+      <w:rPr>
+        <w:u w:val="none"/>
+      </w:rPr>
+    </w:lvl>
+    <w:lvl w:ilvl="5">
+      <w:start w:val="1"/>
+      <w:numFmt w:val="lowerRoman"/>
+      <w:lvlText w:val="%6."/>
+      <w:lvlJc w:val="right"/>
+      <w:pPr>
+        <w:ind w:left="4320" w:hanging="360"/>
+      </w:pPr>
+      <w:rPr>
+        <w:u w:val="none"/>
+      </w:rPr>
+    </w:lvl>
+    <w:lvl w:ilvl="6">
+      <w:start w:val="1"/>
+      <w:numFmt w:val="decimal"/>
+      <w:lvlText w:val="%7."/>
+      <w:lvlJc w:val="left"/>
+      <w:pPr>
+        <w:ind w:left="5040" w:hanging="360"/>
+      </w:pPr>
+      <w:rPr>
+        <w:u w:val="none"/>
+      </w:rPr>
+    </w:lvl>
+    <w:lvl w:ilvl="7">
+      <w:start w:val="1"/>
+      <w:numFmt w:val="lowerLetter"/>
+      <w:lvlText w:val="%8."/>
+      <w:lvlJc w:val="left"/>
+      <w:pPr>
+        <w:ind w:left="5760" w:hanging="360"/>
+      </w:pPr>
+      <w:rPr>
+        <w:u w:val="none"/>
+      </w:rPr>
+    </w:lvl>
+    <w:lvl w:ilvl="8">
+      <w:start w:val="1"/>
+      <w:numFmt w:val="lowerRoman"/>
+      <w:lvlText w:val="%9."/>
+      <w:lvlJc w:val="right"/>
       <w:pPr>
         <w:ind w:left="6480" w:hanging="360"/>
       </w:pPr>
@@ -4888,6 +5915,9 @@
   <w:num w:numId="11">
     <w:abstractNumId w:val="11"/>
   </w:num>
+  <w:num w:numId="12">
+    <w:abstractNumId w:val="12"/>
+  </w:num>
 </w:numbering>
 </file>
 
@@ -4899,18 +5929,26 @@
         <w:rFonts w:ascii="Arial" w:cs="Arial" w:eastAsia="Arial" w:hAnsi="Arial"/>
         <w:sz w:val="24"/>
         <w:szCs w:val="24"/>
-        <w:lang w:val="es-ES"/>
+        <w:lang w:val="es"/>
       </w:rPr>
     </w:rPrDefault>
     <w:pPrDefault>
       <w:pPr/>
     </w:pPrDefault>
   </w:docDefaults>
+  <w:style w:type="table" w:styleId="TableNormal" w:default="1">
+    <w:name w:val="TableNormal"/>
+    <w:tblPr>
+      <w:tblCellMar>
+        <w:top w:w="100.0" w:type="dxa"/>
+        <w:left w:w="100.0" w:type="dxa"/>
+        <w:bottom w:w="100.0" w:type="dxa"/>
+        <w:right w:w="100.0" w:type="dxa"/>
+      </w:tblCellMar>
+    </w:tblPr>
+  </w:style>
   <w:style w:type="paragraph" w:styleId="Normal" w:default="1">
     <w:name w:val="normal"/>
-  </w:style>
-  <w:style w:type="table" w:styleId="TableNormal" w:default="1">
-    <w:name w:val="Table Normal"/>
   </w:style>
   <w:style w:type="paragraph" w:styleId="Heading1">
     <w:name w:val="heading 1"/>
@@ -4933,6 +5971,7 @@
     </w:pPr>
     <w:rPr>
       <w:b w:val="1"/>
+      <w:bCs w:val="1"/>
       <w:sz w:val="20"/>
       <w:szCs w:val="20"/>
     </w:rPr>
@@ -4947,6 +5986,7 @@
     </w:pPr>
     <w:rPr>
       <w:b w:val="1"/>
+      <w:bCs w:val="1"/>
       <w:color w:val="ffffff"/>
       <w:sz w:val="26"/>
       <w:szCs w:val="26"/>
@@ -4962,6 +6002,7 @@
     </w:pPr>
     <w:rPr>
       <w:i w:val="1"/>
+      <w:iCs w:val="1"/>
       <w:sz w:val="18"/>
       <w:szCs w:val="18"/>
     </w:rPr>
@@ -4975,6 +6016,7 @@
     </w:pPr>
     <w:rPr>
       <w:b w:val="1"/>
+      <w:bCs w:val="1"/>
       <w:sz w:val="18"/>
       <w:szCs w:val="18"/>
     </w:rPr>
@@ -4990,6 +6032,7 @@
     </w:pPr>
     <w:rPr>
       <w:b w:val="1"/>
+      <w:bCs w:val="1"/>
       <w:sz w:val="20"/>
       <w:szCs w:val="20"/>
     </w:rPr>
@@ -5005,863 +6048,10 @@
     </w:pPr>
     <w:rPr>
       <w:b w:val="1"/>
+      <w:bCs w:val="1"/>
       <w:sz w:val="72"/>
       <w:szCs w:val="72"/>
     </w:rPr>
-  </w:style>
-  <w:style w:type="paragraph" w:styleId="Normal" w:default="1">
-    <w:name w:val="normal"/>
-  </w:style>
-  <w:style w:type="table" w:styleId="TableNormal" w:default="1">
-    <w:name w:val="Table Normal"/>
-  </w:style>
-  <w:style w:type="paragraph" w:styleId="Heading1">
-    <w:name w:val="heading 1"/>
-    <w:basedOn w:val="Normal"/>
-    <w:next w:val="Normal"/>
-    <w:pPr>
-      <w:keepNext w:val="1"/>
-    </w:pPr>
-    <w:rPr>
-      <w:sz w:val="32"/>
-      <w:szCs w:val="32"/>
-    </w:rPr>
-  </w:style>
-  <w:style w:type="paragraph" w:styleId="Heading2">
-    <w:name w:val="heading 2"/>
-    <w:basedOn w:val="Normal"/>
-    <w:next w:val="Normal"/>
-    <w:pPr>
-      <w:keepNext w:val="1"/>
-    </w:pPr>
-    <w:rPr>
-      <w:b w:val="1"/>
-      <w:sz w:val="20"/>
-      <w:szCs w:val="20"/>
-    </w:rPr>
-  </w:style>
-  <w:style w:type="paragraph" w:styleId="Heading3">
-    <w:name w:val="heading 3"/>
-    <w:basedOn w:val="Normal"/>
-    <w:next w:val="Normal"/>
-    <w:pPr>
-      <w:keepNext w:val="1"/>
-      <w:spacing w:after="60" w:before="60" w:lineRule="auto"/>
-    </w:pPr>
-    <w:rPr>
-      <w:b w:val="1"/>
-      <w:color w:val="ffffff"/>
-      <w:sz w:val="26"/>
-      <w:szCs w:val="26"/>
-    </w:rPr>
-  </w:style>
-  <w:style w:type="paragraph" w:styleId="Heading4">
-    <w:name w:val="heading 4"/>
-    <w:basedOn w:val="Normal"/>
-    <w:next w:val="Normal"/>
-    <w:pPr>
-      <w:keepNext w:val="1"/>
-      <w:spacing w:after="60" w:before="60" w:lineRule="auto"/>
-    </w:pPr>
-    <w:rPr>
-      <w:i w:val="1"/>
-      <w:sz w:val="18"/>
-      <w:szCs w:val="18"/>
-    </w:rPr>
-  </w:style>
-  <w:style w:type="paragraph" w:styleId="Heading5">
-    <w:name w:val="heading 5"/>
-    <w:basedOn w:val="Normal"/>
-    <w:next w:val="Normal"/>
-    <w:pPr>
-      <w:keepNext w:val="1"/>
-    </w:pPr>
-    <w:rPr>
-      <w:b w:val="1"/>
-      <w:sz w:val="18"/>
-      <w:szCs w:val="18"/>
-    </w:rPr>
-  </w:style>
-  <w:style w:type="paragraph" w:styleId="Heading6">
-    <w:name w:val="heading 6"/>
-    <w:basedOn w:val="Normal"/>
-    <w:next w:val="Normal"/>
-    <w:pPr>
-      <w:keepNext w:val="1"/>
-      <w:keepLines w:val="1"/>
-      <w:spacing w:after="40" w:before="200" w:lineRule="auto"/>
-    </w:pPr>
-    <w:rPr>
-      <w:b w:val="1"/>
-      <w:sz w:val="20"/>
-      <w:szCs w:val="20"/>
-    </w:rPr>
-  </w:style>
-  <w:style w:type="paragraph" w:styleId="Title">
-    <w:name w:val="Title"/>
-    <w:basedOn w:val="Normal"/>
-    <w:next w:val="Normal"/>
-    <w:pPr>
-      <w:keepNext w:val="1"/>
-      <w:keepLines w:val="1"/>
-      <w:spacing w:after="120" w:before="480" w:lineRule="auto"/>
-    </w:pPr>
-    <w:rPr>
-      <w:b w:val="1"/>
-      <w:sz w:val="72"/>
-      <w:szCs w:val="72"/>
-    </w:rPr>
-  </w:style>
-  <w:style w:type="paragraph" w:styleId="Normal" w:default="1">
-    <w:name w:val="normal"/>
-  </w:style>
-  <w:style w:type="table" w:styleId="TableNormal" w:default="1">
-    <w:name w:val="Table Normal"/>
-  </w:style>
-  <w:style w:type="paragraph" w:styleId="Heading1">
-    <w:name w:val="heading 1"/>
-    <w:basedOn w:val="Normal"/>
-    <w:next w:val="Normal"/>
-    <w:pPr>
-      <w:keepNext w:val="1"/>
-    </w:pPr>
-    <w:rPr>
-      <w:sz w:val="32"/>
-      <w:szCs w:val="32"/>
-    </w:rPr>
-  </w:style>
-  <w:style w:type="paragraph" w:styleId="Heading2">
-    <w:name w:val="heading 2"/>
-    <w:basedOn w:val="Normal"/>
-    <w:next w:val="Normal"/>
-    <w:pPr>
-      <w:keepNext w:val="1"/>
-    </w:pPr>
-    <w:rPr>
-      <w:b w:val="1"/>
-      <w:sz w:val="20"/>
-      <w:szCs w:val="20"/>
-    </w:rPr>
-  </w:style>
-  <w:style w:type="paragraph" w:styleId="Heading3">
-    <w:name w:val="heading 3"/>
-    <w:basedOn w:val="Normal"/>
-    <w:next w:val="Normal"/>
-    <w:pPr>
-      <w:keepNext w:val="1"/>
-      <w:spacing w:after="60" w:before="60" w:lineRule="auto"/>
-    </w:pPr>
-    <w:rPr>
-      <w:b w:val="1"/>
-      <w:color w:val="ffffff"/>
-      <w:sz w:val="26"/>
-      <w:szCs w:val="26"/>
-    </w:rPr>
-  </w:style>
-  <w:style w:type="paragraph" w:styleId="Heading4">
-    <w:name w:val="heading 4"/>
-    <w:basedOn w:val="Normal"/>
-    <w:next w:val="Normal"/>
-    <w:pPr>
-      <w:keepNext w:val="1"/>
-      <w:spacing w:after="60" w:before="60" w:lineRule="auto"/>
-    </w:pPr>
-    <w:rPr>
-      <w:i w:val="1"/>
-      <w:sz w:val="18"/>
-      <w:szCs w:val="18"/>
-    </w:rPr>
-  </w:style>
-  <w:style w:type="paragraph" w:styleId="Heading5">
-    <w:name w:val="heading 5"/>
-    <w:basedOn w:val="Normal"/>
-    <w:next w:val="Normal"/>
-    <w:pPr>
-      <w:keepNext w:val="1"/>
-    </w:pPr>
-    <w:rPr>
-      <w:b w:val="1"/>
-      <w:sz w:val="18"/>
-      <w:szCs w:val="18"/>
-    </w:rPr>
-  </w:style>
-  <w:style w:type="paragraph" w:styleId="Heading6">
-    <w:name w:val="heading 6"/>
-    <w:basedOn w:val="Normal"/>
-    <w:next w:val="Normal"/>
-    <w:pPr>
-      <w:keepNext w:val="1"/>
-      <w:keepLines w:val="1"/>
-      <w:spacing w:after="40" w:before="200" w:lineRule="auto"/>
-    </w:pPr>
-    <w:rPr>
-      <w:b w:val="1"/>
-      <w:sz w:val="20"/>
-      <w:szCs w:val="20"/>
-    </w:rPr>
-  </w:style>
-  <w:style w:type="paragraph" w:styleId="Title">
-    <w:name w:val="Title"/>
-    <w:basedOn w:val="Normal"/>
-    <w:next w:val="Normal"/>
-    <w:pPr>
-      <w:keepNext w:val="1"/>
-      <w:keepLines w:val="1"/>
-      <w:spacing w:after="120" w:before="480" w:lineRule="auto"/>
-    </w:pPr>
-    <w:rPr>
-      <w:b w:val="1"/>
-      <w:sz w:val="72"/>
-      <w:szCs w:val="72"/>
-    </w:rPr>
-  </w:style>
-  <w:style w:type="paragraph" w:styleId="Normal" w:default="1">
-    <w:name w:val="normal"/>
-  </w:style>
-  <w:style w:type="table" w:styleId="TableNormal" w:default="1">
-    <w:name w:val="Table Normal"/>
-  </w:style>
-  <w:style w:type="paragraph" w:styleId="Heading1">
-    <w:name w:val="heading 1"/>
-    <w:basedOn w:val="Normal"/>
-    <w:next w:val="Normal"/>
-    <w:pPr>
-      <w:keepNext w:val="1"/>
-    </w:pPr>
-    <w:rPr>
-      <w:sz w:val="32"/>
-      <w:szCs w:val="32"/>
-    </w:rPr>
-  </w:style>
-  <w:style w:type="paragraph" w:styleId="Heading2">
-    <w:name w:val="heading 2"/>
-    <w:basedOn w:val="Normal"/>
-    <w:next w:val="Normal"/>
-    <w:pPr>
-      <w:keepNext w:val="1"/>
-    </w:pPr>
-    <w:rPr>
-      <w:b w:val="1"/>
-      <w:sz w:val="20"/>
-      <w:szCs w:val="20"/>
-    </w:rPr>
-  </w:style>
-  <w:style w:type="paragraph" w:styleId="Heading3">
-    <w:name w:val="heading 3"/>
-    <w:basedOn w:val="Normal"/>
-    <w:next w:val="Normal"/>
-    <w:pPr>
-      <w:keepNext w:val="1"/>
-      <w:spacing w:after="60" w:before="60" w:lineRule="auto"/>
-    </w:pPr>
-    <w:rPr>
-      <w:b w:val="1"/>
-      <w:color w:val="ffffff"/>
-      <w:sz w:val="26"/>
-      <w:szCs w:val="26"/>
-    </w:rPr>
-  </w:style>
-  <w:style w:type="paragraph" w:styleId="Heading4">
-    <w:name w:val="heading 4"/>
-    <w:basedOn w:val="Normal"/>
-    <w:next w:val="Normal"/>
-    <w:pPr>
-      <w:keepNext w:val="1"/>
-      <w:spacing w:after="60" w:before="60" w:lineRule="auto"/>
-    </w:pPr>
-    <w:rPr>
-      <w:i w:val="1"/>
-      <w:sz w:val="18"/>
-      <w:szCs w:val="18"/>
-    </w:rPr>
-  </w:style>
-  <w:style w:type="paragraph" w:styleId="Heading5">
-    <w:name w:val="heading 5"/>
-    <w:basedOn w:val="Normal"/>
-    <w:next w:val="Normal"/>
-    <w:pPr>
-      <w:keepNext w:val="1"/>
-    </w:pPr>
-    <w:rPr>
-      <w:b w:val="1"/>
-      <w:sz w:val="18"/>
-      <w:szCs w:val="18"/>
-    </w:rPr>
-  </w:style>
-  <w:style w:type="paragraph" w:styleId="Heading6">
-    <w:name w:val="heading 6"/>
-    <w:basedOn w:val="Normal"/>
-    <w:next w:val="Normal"/>
-    <w:pPr>
-      <w:keepNext w:val="1"/>
-      <w:keepLines w:val="1"/>
-      <w:spacing w:after="40" w:before="200" w:lineRule="auto"/>
-    </w:pPr>
-    <w:rPr>
-      <w:b w:val="1"/>
-      <w:sz w:val="20"/>
-      <w:szCs w:val="20"/>
-    </w:rPr>
-  </w:style>
-  <w:style w:type="paragraph" w:styleId="Title">
-    <w:name w:val="Title"/>
-    <w:basedOn w:val="Normal"/>
-    <w:next w:val="Normal"/>
-    <w:pPr>
-      <w:keepNext w:val="1"/>
-      <w:keepLines w:val="1"/>
-      <w:spacing w:after="120" w:before="480" w:lineRule="auto"/>
-    </w:pPr>
-    <w:rPr>
-      <w:b w:val="1"/>
-      <w:sz w:val="72"/>
-      <w:szCs w:val="72"/>
-    </w:rPr>
-  </w:style>
-  <w:style w:type="paragraph" w:styleId="Normal" w:default="1">
-    <w:name w:val="Normal"/>
-    <w:qFormat w:val="1"/>
-    <w:rsid w:val="00942D5E"/>
-    <w:rPr>
-      <w:lang w:eastAsia="es-ES"/>
-    </w:rPr>
-  </w:style>
-  <w:style w:type="paragraph" w:styleId="Ttulo1">
-    <w:name w:val="heading 1"/>
-    <w:basedOn w:val="Normal"/>
-    <w:next w:val="Normal"/>
-    <w:uiPriority w:val="9"/>
-    <w:qFormat w:val="1"/>
-    <w:pPr>
-      <w:keepNext w:val="1"/>
-      <w:outlineLvl w:val="0"/>
-    </w:pPr>
-    <w:rPr>
-      <w:sz w:val="32"/>
-    </w:rPr>
-  </w:style>
-  <w:style w:type="paragraph" w:styleId="Ttulo2">
-    <w:name w:val="heading 2"/>
-    <w:basedOn w:val="Normal"/>
-    <w:next w:val="Normal"/>
-    <w:uiPriority w:val="9"/>
-    <w:semiHidden w:val="1"/>
-    <w:unhideWhenUsed w:val="1"/>
-    <w:qFormat w:val="1"/>
-    <w:pPr>
-      <w:keepNext w:val="1"/>
-      <w:outlineLvl w:val="1"/>
-    </w:pPr>
-    <w:rPr>
-      <w:b w:val="1"/>
-      <w:sz w:val="20"/>
-    </w:rPr>
-  </w:style>
-  <w:style w:type="paragraph" w:styleId="Ttulo3">
-    <w:name w:val="heading 3"/>
-    <w:basedOn w:val="Normal"/>
-    <w:next w:val="Normal"/>
-    <w:uiPriority w:val="9"/>
-    <w:semiHidden w:val="1"/>
-    <w:unhideWhenUsed w:val="1"/>
-    <w:qFormat w:val="1"/>
-    <w:pPr>
-      <w:keepNext w:val="1"/>
-      <w:spacing w:after="60" w:before="60"/>
-      <w:outlineLvl w:val="2"/>
-    </w:pPr>
-    <w:rPr>
-      <w:b w:val="1"/>
-      <w:color w:val="ffffff"/>
-      <w:sz w:val="26"/>
-    </w:rPr>
-  </w:style>
-  <w:style w:type="paragraph" w:styleId="Ttulo4">
-    <w:name w:val="heading 4"/>
-    <w:basedOn w:val="Normal"/>
-    <w:next w:val="Normal"/>
-    <w:uiPriority w:val="9"/>
-    <w:semiHidden w:val="1"/>
-    <w:unhideWhenUsed w:val="1"/>
-    <w:qFormat w:val="1"/>
-    <w:pPr>
-      <w:keepNext w:val="1"/>
-      <w:spacing w:after="60" w:before="60"/>
-      <w:outlineLvl w:val="3"/>
-    </w:pPr>
-    <w:rPr>
-      <w:i w:val="1"/>
-      <w:sz w:val="18"/>
-    </w:rPr>
-  </w:style>
-  <w:style w:type="paragraph" w:styleId="Ttulo5">
-    <w:name w:val="heading 5"/>
-    <w:basedOn w:val="Normal"/>
-    <w:next w:val="Normal"/>
-    <w:uiPriority w:val="9"/>
-    <w:semiHidden w:val="1"/>
-    <w:unhideWhenUsed w:val="1"/>
-    <w:qFormat w:val="1"/>
-    <w:pPr>
-      <w:keepNext w:val="1"/>
-      <w:outlineLvl w:val="4"/>
-    </w:pPr>
-    <w:rPr>
-      <w:b w:val="1"/>
-      <w:sz w:val="18"/>
-    </w:rPr>
-  </w:style>
-  <w:style w:type="paragraph" w:styleId="Ttulo6">
-    <w:name w:val="heading 6"/>
-    <w:basedOn w:val="Normal"/>
-    <w:next w:val="Normal"/>
-    <w:uiPriority w:val="9"/>
-    <w:semiHidden w:val="1"/>
-    <w:unhideWhenUsed w:val="1"/>
-    <w:qFormat w:val="1"/>
-    <w:pPr>
-      <w:keepNext w:val="1"/>
-      <w:keepLines w:val="1"/>
-      <w:spacing w:after="40" w:before="200"/>
-      <w:outlineLvl w:val="5"/>
-    </w:pPr>
-    <w:rPr>
-      <w:b w:val="1"/>
-      <w:sz w:val="20"/>
-      <w:szCs w:val="20"/>
-    </w:rPr>
-  </w:style>
-  <w:style w:type="character" w:styleId="Fuentedeprrafopredeter" w:default="1">
-    <w:name w:val="Default Paragraph Font"/>
-    <w:uiPriority w:val="1"/>
-    <w:semiHidden w:val="1"/>
-    <w:unhideWhenUsed w:val="1"/>
-  </w:style>
-  <w:style w:type="table" w:styleId="Tablanormal" w:default="1">
-    <w:name w:val="Normal Table"/>
-    <w:uiPriority w:val="99"/>
-    <w:semiHidden w:val="1"/>
-    <w:unhideWhenUsed w:val="1"/>
-    <w:tblPr>
-      <w:tblInd w:w="0.0" w:type="dxa"/>
-      <w:tblCellMar>
-        <w:top w:w="0.0" w:type="dxa"/>
-        <w:left w:w="108.0" w:type="dxa"/>
-        <w:bottom w:w="0.0" w:type="dxa"/>
-        <w:right w:w="108.0" w:type="dxa"/>
-      </w:tblCellMar>
-    </w:tblPr>
-  </w:style>
-  <w:style w:type="numbering" w:styleId="Sinlista" w:default="1">
-    <w:name w:val="No List"/>
-    <w:uiPriority w:val="99"/>
-    <w:semiHidden w:val="1"/>
-    <w:unhideWhenUsed w:val="1"/>
-  </w:style>
-  <w:style w:type="table" w:styleId="TableNormal" w:customStyle="1">
-    <w:name w:val="Table Normal"/>
-    <w:tblPr>
-      <w:tblCellMar>
-        <w:top w:w="0.0" w:type="dxa"/>
-        <w:left w:w="0.0" w:type="dxa"/>
-        <w:bottom w:w="0.0" w:type="dxa"/>
-        <w:right w:w="0.0" w:type="dxa"/>
-      </w:tblCellMar>
-    </w:tblPr>
-  </w:style>
-  <w:style w:type="paragraph" w:styleId="Ttulo">
-    <w:name w:val="Title"/>
-    <w:basedOn w:val="Normal"/>
-    <w:next w:val="Normal"/>
-    <w:uiPriority w:val="10"/>
-    <w:qFormat w:val="1"/>
-    <w:pPr>
-      <w:keepNext w:val="1"/>
-      <w:keepLines w:val="1"/>
-      <w:spacing w:after="120" w:before="480"/>
-    </w:pPr>
-    <w:rPr>
-      <w:b w:val="1"/>
-      <w:sz w:val="72"/>
-      <w:szCs w:val="72"/>
-    </w:rPr>
-  </w:style>
-  <w:style w:type="table" w:styleId="TableNormal0" w:customStyle="1">
-    <w:name w:val="Table Normal"/>
-    <w:tblPr>
-      <w:tblCellMar>
-        <w:top w:w="0.0" w:type="dxa"/>
-        <w:left w:w="0.0" w:type="dxa"/>
-        <w:bottom w:w="0.0" w:type="dxa"/>
-        <w:right w:w="0.0" w:type="dxa"/>
-      </w:tblCellMar>
-    </w:tblPr>
-  </w:style>
-  <w:style w:type="paragraph" w:styleId="Encabezado">
-    <w:name w:val="header"/>
-    <w:basedOn w:val="Normal"/>
-    <w:pPr>
-      <w:tabs>
-        <w:tab w:val="center" w:pos="4320"/>
-        <w:tab w:val="right" w:pos="8640"/>
-      </w:tabs>
-    </w:pPr>
-    <w:rPr>
-      <w:b w:val="1"/>
-      <w:sz w:val="18"/>
-    </w:rPr>
-  </w:style>
-  <w:style w:type="paragraph" w:styleId="Piedepgina">
-    <w:name w:val="footer"/>
-    <w:basedOn w:val="Normal"/>
-    <w:pPr>
-      <w:tabs>
-        <w:tab w:val="center" w:pos="4320"/>
-        <w:tab w:val="right" w:pos="8640"/>
-      </w:tabs>
-    </w:pPr>
-  </w:style>
-  <w:style w:type="paragraph" w:styleId="Listaconnmeros">
-    <w:name w:val="List Number"/>
-    <w:basedOn w:val="Normal"/>
-    <w:pPr>
-      <w:tabs>
-        <w:tab w:val="left" w:pos="360"/>
-      </w:tabs>
-      <w:ind w:left="360" w:hanging="360"/>
-    </w:pPr>
-  </w:style>
-  <w:style w:type="paragraph" w:styleId="CovFormText" w:customStyle="1">
-    <w:name w:val="Cov_Form Text"/>
-    <w:basedOn w:val="Encabezado"/>
-    <w:pPr>
-      <w:tabs>
-        <w:tab w:val="clear" w:pos="4320"/>
-        <w:tab w:val="clear" w:pos="8640"/>
-      </w:tabs>
-      <w:spacing w:after="60" w:before="60"/>
-    </w:pPr>
-    <w:rPr>
-      <w:b w:val="0"/>
-      <w:noProof w:val="1"/>
-    </w:rPr>
-  </w:style>
-  <w:style w:type="paragraph" w:styleId="Textonotapie">
-    <w:name w:val="footnote text"/>
-    <w:basedOn w:val="Normal"/>
-    <w:semiHidden w:val="1"/>
-    <w:rPr>
-      <w:sz w:val="18"/>
-    </w:rPr>
-  </w:style>
-  <w:style w:type="character" w:styleId="Refdenotaalpie">
-    <w:name w:val="footnote reference"/>
-    <w:semiHidden w:val="1"/>
-    <w:rPr>
-      <w:sz w:val="20"/>
-      <w:vertAlign w:val="superscript"/>
-    </w:rPr>
-  </w:style>
-  <w:style w:type="paragraph" w:styleId="ABodyBullet1" w:customStyle="1">
-    <w:name w:val="A_Body Bullet 1"/>
-    <w:basedOn w:val="Normal"/>
-    <w:pPr>
-      <w:spacing w:after="60" w:before="60"/>
-    </w:pPr>
-    <w:rPr>
-      <w:sz w:val="22"/>
-    </w:rPr>
-  </w:style>
-  <w:style w:type="character" w:styleId="Refdecomentario">
-    <w:name w:val="annotation reference"/>
-    <w:semiHidden w:val="1"/>
-    <w:rPr>
-      <w:sz w:val="16"/>
-    </w:rPr>
-  </w:style>
-  <w:style w:type="paragraph" w:styleId="Textocomentario">
-    <w:name w:val="annotation text"/>
-    <w:basedOn w:val="Normal"/>
-    <w:semiHidden w:val="1"/>
-    <w:rPr>
-      <w:sz w:val="20"/>
-    </w:rPr>
-  </w:style>
-  <w:style w:type="character" w:styleId="Hipervnculo">
-    <w:name w:val="Hyperlink"/>
-    <w:rPr>
-      <w:color w:val="0000ff"/>
-      <w:u w:val="single"/>
-    </w:rPr>
-  </w:style>
-  <w:style w:type="character" w:styleId="Hipervnculovisitado">
-    <w:name w:val="FollowedHyperlink"/>
-    <w:rPr>
-      <w:color w:val="800080"/>
-      <w:u w:val="single"/>
-    </w:rPr>
-  </w:style>
-  <w:style w:type="paragraph" w:styleId="TemplateNote" w:customStyle="1">
-    <w:name w:val="Template Note"/>
-    <w:basedOn w:val="Normal"/>
-    <w:pPr>
-      <w:keepNext w:val="1"/>
-      <w:widowControl w:val="0"/>
-      <w:pBdr>
-        <w:top w:color="auto" w:space="1" w:sz="6" w:val="single"/>
-        <w:left w:color="auto" w:space="1" w:sz="6" w:val="single"/>
-        <w:bottom w:color="auto" w:space="1" w:sz="6" w:val="single"/>
-        <w:right w:color="auto" w:space="1" w:sz="6" w:val="single"/>
-      </w:pBdr>
-      <w:shd w:color="auto" w:fill="auto" w:val="pct5"/>
-      <w:spacing w:after="80" w:before="80"/>
-      <w:jc w:val="both"/>
-    </w:pPr>
-    <w:rPr>
-      <w:rFonts w:ascii="Times New Roman" w:hAnsi="Times New Roman"/>
-      <w:i w:val="1"/>
-      <w:snapToGrid w:val="0"/>
-      <w:color w:val="0000ff"/>
-      <w:sz w:val="20"/>
-      <w:lang w:eastAsia="en-US"/>
-    </w:rPr>
-  </w:style>
-  <w:style w:type="paragraph" w:styleId="Textodeglobo">
-    <w:name w:val="Balloon Text"/>
-    <w:basedOn w:val="Normal"/>
-    <w:semiHidden w:val="1"/>
-    <w:rPr>
-      <w:rFonts w:ascii="Tahoma" w:cs="Tahoma" w:hAnsi="Tahoma"/>
-      <w:sz w:val="16"/>
-      <w:szCs w:val="16"/>
-    </w:rPr>
-  </w:style>
-  <w:style w:type="paragraph" w:styleId="Mapadeldocumento">
-    <w:name w:val="Document Map"/>
-    <w:basedOn w:val="Normal"/>
-    <w:semiHidden w:val="1"/>
-    <w:pPr>
-      <w:shd w:color="auto" w:fill="000080" w:val="clear"/>
-    </w:pPr>
-    <w:rPr>
-      <w:rFonts w:ascii="Tahoma" w:cs="Tahoma" w:hAnsi="Tahoma"/>
-      <w:sz w:val="20"/>
-    </w:rPr>
-  </w:style>
-  <w:style w:type="paragraph" w:styleId="Asuntodelcomentario">
-    <w:name w:val="annotation subject"/>
-    <w:basedOn w:val="Textocomentario"/>
-    <w:next w:val="Textocomentario"/>
-    <w:semiHidden w:val="1"/>
-    <w:rPr>
-      <w:b w:val="1"/>
-      <w:bCs w:val="1"/>
-    </w:rPr>
-  </w:style>
-  <w:style w:type="paragraph" w:styleId="CovTableText" w:customStyle="1">
-    <w:name w:val="Cov_Table Text"/>
-    <w:basedOn w:val="Encabezado"/>
-    <w:pPr>
-      <w:tabs>
-        <w:tab w:val="clear" w:pos="4320"/>
-        <w:tab w:val="clear" w:pos="8640"/>
-      </w:tabs>
-      <w:spacing w:after="60" w:before="60"/>
-    </w:pPr>
-    <w:rPr>
-      <w:b w:val="0"/>
-      <w:lang w:eastAsia="en-US" w:val="en-US"/>
-    </w:rPr>
-  </w:style>
-  <w:style w:type="table" w:styleId="Tablaconcuadrcula">
-    <w:name w:val="Table Grid"/>
-    <w:basedOn w:val="Tablanormal"/>
-    <w:rsid w:val="00DF2BD2"/>
-    <w:tblPr>
-      <w:tblBorders>
-        <w:top w:color="auto" w:space="0" w:sz="4" w:val="single"/>
-        <w:left w:color="auto" w:space="0" w:sz="4" w:val="single"/>
-        <w:bottom w:color="auto" w:space="0" w:sz="4" w:val="single"/>
-        <w:right w:color="auto" w:space="0" w:sz="4" w:val="single"/>
-        <w:insideH w:color="auto" w:space="0" w:sz="4" w:val="single"/>
-        <w:insideV w:color="auto" w:space="0" w:sz="4" w:val="single"/>
-      </w:tblBorders>
-    </w:tblPr>
-  </w:style>
-  <w:style w:type="paragraph" w:styleId="Subttulo">
-    <w:name w:val="Subtitle"/>
-    <w:basedOn w:val="Normal"/>
-    <w:next w:val="Normal"/>
-    <w:uiPriority w:val="11"/>
-    <w:qFormat w:val="1"/>
-    <w:pPr>
-      <w:keepNext w:val="1"/>
-      <w:keepLines w:val="1"/>
-      <w:spacing w:after="80" w:before="360"/>
-    </w:pPr>
-    <w:rPr>
-      <w:rFonts w:ascii="Georgia" w:cs="Georgia" w:eastAsia="Georgia" w:hAnsi="Georgia"/>
-      <w:i w:val="1"/>
-      <w:color w:val="666666"/>
-      <w:sz w:val="48"/>
-      <w:szCs w:val="48"/>
-    </w:rPr>
-  </w:style>
-  <w:style w:type="table" w:styleId="a" w:customStyle="1">
-    <w:basedOn w:val="TableNormal0"/>
-    <w:tblPr>
-      <w:tblStyleRowBandSize w:val="1"/>
-      <w:tblStyleColBandSize w:val="1"/>
-      <w:tblCellMar>
-        <w:top w:w="0.0" w:type="dxa"/>
-        <w:left w:w="115.0" w:type="dxa"/>
-        <w:bottom w:w="0.0" w:type="dxa"/>
-        <w:right w:w="115.0" w:type="dxa"/>
-      </w:tblCellMar>
-    </w:tblPr>
-  </w:style>
-  <w:style w:type="table" w:styleId="a0" w:customStyle="1">
-    <w:basedOn w:val="TableNormal0"/>
-    <w:tblPr>
-      <w:tblStyleRowBandSize w:val="1"/>
-      <w:tblStyleColBandSize w:val="1"/>
-      <w:tblCellMar>
-        <w:top w:w="0.0" w:type="dxa"/>
-        <w:left w:w="115.0" w:type="dxa"/>
-        <w:bottom w:w="0.0" w:type="dxa"/>
-        <w:right w:w="115.0" w:type="dxa"/>
-      </w:tblCellMar>
-    </w:tblPr>
-  </w:style>
-  <w:style w:type="table" w:styleId="a1" w:customStyle="1">
-    <w:basedOn w:val="TableNormal0"/>
-    <w:tblPr>
-      <w:tblStyleRowBandSize w:val="1"/>
-      <w:tblStyleColBandSize w:val="1"/>
-      <w:tblCellMar>
-        <w:top w:w="0.0" w:type="dxa"/>
-        <w:left w:w="115.0" w:type="dxa"/>
-        <w:bottom w:w="0.0" w:type="dxa"/>
-        <w:right w:w="115.0" w:type="dxa"/>
-      </w:tblCellMar>
-    </w:tblPr>
-  </w:style>
-  <w:style w:type="table" w:styleId="a2" w:customStyle="1">
-    <w:basedOn w:val="TableNormal0"/>
-    <w:tblPr>
-      <w:tblStyleRowBandSize w:val="1"/>
-      <w:tblStyleColBandSize w:val="1"/>
-      <w:tblCellMar>
-        <w:top w:w="0.0" w:type="dxa"/>
-        <w:left w:w="115.0" w:type="dxa"/>
-        <w:bottom w:w="0.0" w:type="dxa"/>
-        <w:right w:w="115.0" w:type="dxa"/>
-      </w:tblCellMar>
-    </w:tblPr>
-  </w:style>
-  <w:style w:type="table" w:styleId="a3" w:customStyle="1">
-    <w:basedOn w:val="TableNormal0"/>
-    <w:tblPr>
-      <w:tblStyleRowBandSize w:val="1"/>
-      <w:tblStyleColBandSize w:val="1"/>
-      <w:tblCellMar>
-        <w:top w:w="0.0" w:type="dxa"/>
-        <w:left w:w="115.0" w:type="dxa"/>
-        <w:bottom w:w="0.0" w:type="dxa"/>
-        <w:right w:w="115.0" w:type="dxa"/>
-      </w:tblCellMar>
-    </w:tblPr>
-  </w:style>
-  <w:style w:type="table" w:styleId="a4" w:customStyle="1">
-    <w:basedOn w:val="TableNormal0"/>
-    <w:tblPr>
-      <w:tblStyleRowBandSize w:val="1"/>
-      <w:tblStyleColBandSize w:val="1"/>
-      <w:tblCellMar>
-        <w:top w:w="0.0" w:type="dxa"/>
-        <w:left w:w="115.0" w:type="dxa"/>
-        <w:bottom w:w="0.0" w:type="dxa"/>
-        <w:right w:w="115.0" w:type="dxa"/>
-      </w:tblCellMar>
-    </w:tblPr>
-  </w:style>
-  <w:style w:type="table" w:styleId="a5" w:customStyle="1">
-    <w:basedOn w:val="TableNormal0"/>
-    <w:tblPr>
-      <w:tblStyleRowBandSize w:val="1"/>
-      <w:tblStyleColBandSize w:val="1"/>
-      <w:tblCellMar>
-        <w:top w:w="0.0" w:type="dxa"/>
-        <w:left w:w="115.0" w:type="dxa"/>
-        <w:bottom w:w="0.0" w:type="dxa"/>
-        <w:right w:w="115.0" w:type="dxa"/>
-      </w:tblCellMar>
-    </w:tblPr>
-  </w:style>
-  <w:style w:type="table" w:styleId="a6" w:customStyle="1">
-    <w:basedOn w:val="TableNormal0"/>
-    <w:tblPr>
-      <w:tblStyleRowBandSize w:val="1"/>
-      <w:tblStyleColBandSize w:val="1"/>
-      <w:tblCellMar>
-        <w:top w:w="0.0" w:type="dxa"/>
-        <w:left w:w="115.0" w:type="dxa"/>
-        <w:bottom w:w="0.0" w:type="dxa"/>
-        <w:right w:w="115.0" w:type="dxa"/>
-      </w:tblCellMar>
-    </w:tblPr>
-  </w:style>
-  <w:style w:type="table" w:styleId="a7" w:customStyle="1">
-    <w:basedOn w:val="TableNormal0"/>
-    <w:tblPr>
-      <w:tblStyleRowBandSize w:val="1"/>
-      <w:tblStyleColBandSize w:val="1"/>
-      <w:tblCellMar>
-        <w:top w:w="0.0" w:type="dxa"/>
-        <w:left w:w="115.0" w:type="dxa"/>
-        <w:bottom w:w="0.0" w:type="dxa"/>
-        <w:right w:w="115.0" w:type="dxa"/>
-      </w:tblCellMar>
-    </w:tblPr>
-  </w:style>
-  <w:style w:type="table" w:styleId="a8" w:customStyle="1">
-    <w:basedOn w:val="TableNormal0"/>
-    <w:tblPr>
-      <w:tblStyleRowBandSize w:val="1"/>
-      <w:tblStyleColBandSize w:val="1"/>
-      <w:tblCellMar>
-        <w:top w:w="0.0" w:type="dxa"/>
-        <w:left w:w="115.0" w:type="dxa"/>
-        <w:bottom w:w="0.0" w:type="dxa"/>
-        <w:right w:w="115.0" w:type="dxa"/>
-      </w:tblCellMar>
-    </w:tblPr>
-  </w:style>
-  <w:style w:type="table" w:styleId="a9" w:customStyle="1">
-    <w:basedOn w:val="TableNormal0"/>
-    <w:tblPr>
-      <w:tblStyleRowBandSize w:val="1"/>
-      <w:tblStyleColBandSize w:val="1"/>
-      <w:tblCellMar>
-        <w:top w:w="0.0" w:type="dxa"/>
-        <w:left w:w="115.0" w:type="dxa"/>
-        <w:bottom w:w="0.0" w:type="dxa"/>
-        <w:right w:w="115.0" w:type="dxa"/>
-      </w:tblCellMar>
-    </w:tblPr>
-  </w:style>
-  <w:style w:type="table" w:styleId="aa" w:customStyle="1">
-    <w:basedOn w:val="TableNormal0"/>
-    <w:tblPr>
-      <w:tblStyleRowBandSize w:val="1"/>
-      <w:tblStyleColBandSize w:val="1"/>
-      <w:tblCellMar>
-        <w:top w:w="0.0" w:type="dxa"/>
-        <w:left w:w="115.0" w:type="dxa"/>
-        <w:bottom w:w="0.0" w:type="dxa"/>
-        <w:right w:w="115.0" w:type="dxa"/>
-      </w:tblCellMar>
-    </w:tblPr>
   </w:style>
   <w:style w:type="paragraph" w:styleId="Subtitle">
     <w:name w:val="Subtitle"/>
@@ -5875,291 +6065,7 @@
     <w:rPr>
       <w:rFonts w:ascii="Georgia" w:cs="Georgia" w:eastAsia="Georgia" w:hAnsi="Georgia"/>
       <w:i w:val="1"/>
-      <w:color w:val="666666"/>
-      <w:sz w:val="48"/>
-      <w:szCs w:val="48"/>
-    </w:rPr>
-  </w:style>
-  <w:style w:type="table" w:styleId="Table1">
-    <w:basedOn w:val="TableNormal"/>
-    <w:tblPr>
-      <w:tblStyleRowBandSize w:val="1"/>
-      <w:tblStyleColBandSize w:val="1"/>
-      <w:tblCellMar>
-        <w:top w:w="0.0" w:type="dxa"/>
-        <w:left w:w="115.0" w:type="dxa"/>
-        <w:bottom w:w="0.0" w:type="dxa"/>
-        <w:right w:w="115.0" w:type="dxa"/>
-      </w:tblCellMar>
-    </w:tblPr>
-  </w:style>
-  <w:style w:type="table" w:styleId="Table2">
-    <w:basedOn w:val="TableNormal"/>
-    <w:tblPr>
-      <w:tblStyleRowBandSize w:val="1"/>
-      <w:tblStyleColBandSize w:val="1"/>
-      <w:tblCellMar>
-        <w:top w:w="0.0" w:type="dxa"/>
-        <w:left w:w="115.0" w:type="dxa"/>
-        <w:bottom w:w="0.0" w:type="dxa"/>
-        <w:right w:w="115.0" w:type="dxa"/>
-      </w:tblCellMar>
-    </w:tblPr>
-  </w:style>
-  <w:style w:type="table" w:styleId="Table3">
-    <w:basedOn w:val="TableNormal"/>
-    <w:tblPr>
-      <w:tblStyleRowBandSize w:val="1"/>
-      <w:tblStyleColBandSize w:val="1"/>
-      <w:tblCellMar>
-        <w:top w:w="0.0" w:type="dxa"/>
-        <w:left w:w="115.0" w:type="dxa"/>
-        <w:bottom w:w="0.0" w:type="dxa"/>
-        <w:right w:w="115.0" w:type="dxa"/>
-      </w:tblCellMar>
-    </w:tblPr>
-  </w:style>
-  <w:style w:type="table" w:styleId="Table4">
-    <w:basedOn w:val="TableNormal"/>
-    <w:tblPr>
-      <w:tblStyleRowBandSize w:val="1"/>
-      <w:tblStyleColBandSize w:val="1"/>
-      <w:tblCellMar>
-        <w:top w:w="0.0" w:type="dxa"/>
-        <w:left w:w="115.0" w:type="dxa"/>
-        <w:bottom w:w="0.0" w:type="dxa"/>
-        <w:right w:w="115.0" w:type="dxa"/>
-      </w:tblCellMar>
-    </w:tblPr>
-  </w:style>
-  <w:style w:type="table" w:styleId="Table5">
-    <w:basedOn w:val="TableNormal"/>
-    <w:tblPr>
-      <w:tblStyleRowBandSize w:val="1"/>
-      <w:tblStyleColBandSize w:val="1"/>
-      <w:tblCellMar>
-        <w:top w:w="0.0" w:type="dxa"/>
-        <w:left w:w="115.0" w:type="dxa"/>
-        <w:bottom w:w="0.0" w:type="dxa"/>
-        <w:right w:w="115.0" w:type="dxa"/>
-      </w:tblCellMar>
-    </w:tblPr>
-  </w:style>
-  <w:style w:type="table" w:styleId="Table6">
-    <w:basedOn w:val="TableNormal"/>
-    <w:tblPr>
-      <w:tblStyleRowBandSize w:val="1"/>
-      <w:tblStyleColBandSize w:val="1"/>
-      <w:tblCellMar>
-        <w:top w:w="0.0" w:type="dxa"/>
-        <w:left w:w="115.0" w:type="dxa"/>
-        <w:bottom w:w="0.0" w:type="dxa"/>
-        <w:right w:w="115.0" w:type="dxa"/>
-      </w:tblCellMar>
-    </w:tblPr>
-  </w:style>
-  <w:style w:type="paragraph" w:styleId="Subtitle">
-    <w:name w:val="Subtitle"/>
-    <w:basedOn w:val="Normal"/>
-    <w:next w:val="Normal"/>
-    <w:pPr>
-      <w:keepNext w:val="1"/>
-      <w:keepLines w:val="1"/>
-      <w:spacing w:after="80" w:before="360" w:lineRule="auto"/>
-    </w:pPr>
-    <w:rPr>
-      <w:rFonts w:ascii="Georgia" w:cs="Georgia" w:eastAsia="Georgia" w:hAnsi="Georgia"/>
-      <w:i w:val="1"/>
-      <w:color w:val="666666"/>
-      <w:sz w:val="48"/>
-      <w:szCs w:val="48"/>
-    </w:rPr>
-  </w:style>
-  <w:style w:type="table" w:styleId="Table1">
-    <w:basedOn w:val="TableNormal"/>
-    <w:tblPr>
-      <w:tblStyleRowBandSize w:val="1"/>
-      <w:tblStyleColBandSize w:val="1"/>
-      <w:tblCellMar>
-        <w:top w:w="0.0" w:type="dxa"/>
-        <w:left w:w="115.0" w:type="dxa"/>
-        <w:bottom w:w="0.0" w:type="dxa"/>
-        <w:right w:w="115.0" w:type="dxa"/>
-      </w:tblCellMar>
-    </w:tblPr>
-  </w:style>
-  <w:style w:type="table" w:styleId="Table2">
-    <w:basedOn w:val="TableNormal"/>
-    <w:tblPr>
-      <w:tblStyleRowBandSize w:val="1"/>
-      <w:tblStyleColBandSize w:val="1"/>
-      <w:tblCellMar>
-        <w:top w:w="0.0" w:type="dxa"/>
-        <w:left w:w="115.0" w:type="dxa"/>
-        <w:bottom w:w="0.0" w:type="dxa"/>
-        <w:right w:w="115.0" w:type="dxa"/>
-      </w:tblCellMar>
-    </w:tblPr>
-  </w:style>
-  <w:style w:type="table" w:styleId="Table3">
-    <w:basedOn w:val="TableNormal"/>
-    <w:tblPr>
-      <w:tblStyleRowBandSize w:val="1"/>
-      <w:tblStyleColBandSize w:val="1"/>
-      <w:tblCellMar>
-        <w:top w:w="0.0" w:type="dxa"/>
-        <w:left w:w="115.0" w:type="dxa"/>
-        <w:bottom w:w="0.0" w:type="dxa"/>
-        <w:right w:w="115.0" w:type="dxa"/>
-      </w:tblCellMar>
-    </w:tblPr>
-  </w:style>
-  <w:style w:type="table" w:styleId="Table4">
-    <w:basedOn w:val="TableNormal"/>
-    <w:tblPr>
-      <w:tblStyleRowBandSize w:val="1"/>
-      <w:tblStyleColBandSize w:val="1"/>
-      <w:tblCellMar>
-        <w:top w:w="0.0" w:type="dxa"/>
-        <w:left w:w="115.0" w:type="dxa"/>
-        <w:bottom w:w="0.0" w:type="dxa"/>
-        <w:right w:w="115.0" w:type="dxa"/>
-      </w:tblCellMar>
-    </w:tblPr>
-  </w:style>
-  <w:style w:type="table" w:styleId="Table5">
-    <w:basedOn w:val="TableNormal"/>
-    <w:tblPr>
-      <w:tblStyleRowBandSize w:val="1"/>
-      <w:tblStyleColBandSize w:val="1"/>
-      <w:tblCellMar>
-        <w:top w:w="0.0" w:type="dxa"/>
-        <w:left w:w="115.0" w:type="dxa"/>
-        <w:bottom w:w="0.0" w:type="dxa"/>
-        <w:right w:w="115.0" w:type="dxa"/>
-      </w:tblCellMar>
-    </w:tblPr>
-  </w:style>
-  <w:style w:type="table" w:styleId="Table6">
-    <w:basedOn w:val="TableNormal"/>
-    <w:tblPr>
-      <w:tblStyleRowBandSize w:val="1"/>
-      <w:tblStyleColBandSize w:val="1"/>
-      <w:tblCellMar>
-        <w:top w:w="0.0" w:type="dxa"/>
-        <w:left w:w="115.0" w:type="dxa"/>
-        <w:bottom w:w="0.0" w:type="dxa"/>
-        <w:right w:w="115.0" w:type="dxa"/>
-      </w:tblCellMar>
-    </w:tblPr>
-  </w:style>
-  <w:style w:type="paragraph" w:styleId="Subtitle">
-    <w:name w:val="Subtitle"/>
-    <w:basedOn w:val="Normal"/>
-    <w:next w:val="Normal"/>
-    <w:pPr>
-      <w:keepNext w:val="1"/>
-      <w:keepLines w:val="1"/>
-      <w:spacing w:after="80" w:before="360" w:lineRule="auto"/>
-    </w:pPr>
-    <w:rPr>
-      <w:rFonts w:ascii="Georgia" w:cs="Georgia" w:eastAsia="Georgia" w:hAnsi="Georgia"/>
-      <w:i w:val="1"/>
-      <w:color w:val="666666"/>
-      <w:sz w:val="48"/>
-      <w:szCs w:val="48"/>
-    </w:rPr>
-  </w:style>
-  <w:style w:type="table" w:styleId="Table1">
-    <w:basedOn w:val="TableNormal"/>
-    <w:tblPr>
-      <w:tblStyleRowBandSize w:val="1"/>
-      <w:tblStyleColBandSize w:val="1"/>
-      <w:tblCellMar>
-        <w:top w:w="0.0" w:type="dxa"/>
-        <w:left w:w="115.0" w:type="dxa"/>
-        <w:bottom w:w="0.0" w:type="dxa"/>
-        <w:right w:w="115.0" w:type="dxa"/>
-      </w:tblCellMar>
-    </w:tblPr>
-  </w:style>
-  <w:style w:type="table" w:styleId="Table2">
-    <w:basedOn w:val="TableNormal"/>
-    <w:tblPr>
-      <w:tblStyleRowBandSize w:val="1"/>
-      <w:tblStyleColBandSize w:val="1"/>
-      <w:tblCellMar>
-        <w:top w:w="0.0" w:type="dxa"/>
-        <w:left w:w="115.0" w:type="dxa"/>
-        <w:bottom w:w="0.0" w:type="dxa"/>
-        <w:right w:w="115.0" w:type="dxa"/>
-      </w:tblCellMar>
-    </w:tblPr>
-  </w:style>
-  <w:style w:type="table" w:styleId="Table3">
-    <w:basedOn w:val="TableNormal"/>
-    <w:tblPr>
-      <w:tblStyleRowBandSize w:val="1"/>
-      <w:tblStyleColBandSize w:val="1"/>
-      <w:tblCellMar>
-        <w:top w:w="0.0" w:type="dxa"/>
-        <w:left w:w="115.0" w:type="dxa"/>
-        <w:bottom w:w="0.0" w:type="dxa"/>
-        <w:right w:w="115.0" w:type="dxa"/>
-      </w:tblCellMar>
-    </w:tblPr>
-  </w:style>
-  <w:style w:type="table" w:styleId="Table4">
-    <w:basedOn w:val="TableNormal"/>
-    <w:tblPr>
-      <w:tblStyleRowBandSize w:val="1"/>
-      <w:tblStyleColBandSize w:val="1"/>
-      <w:tblCellMar>
-        <w:top w:w="0.0" w:type="dxa"/>
-        <w:left w:w="115.0" w:type="dxa"/>
-        <w:bottom w:w="0.0" w:type="dxa"/>
-        <w:right w:w="115.0" w:type="dxa"/>
-      </w:tblCellMar>
-    </w:tblPr>
-  </w:style>
-  <w:style w:type="table" w:styleId="Table5">
-    <w:basedOn w:val="TableNormal"/>
-    <w:tblPr>
-      <w:tblStyleRowBandSize w:val="1"/>
-      <w:tblStyleColBandSize w:val="1"/>
-      <w:tblCellMar>
-        <w:top w:w="0.0" w:type="dxa"/>
-        <w:left w:w="115.0" w:type="dxa"/>
-        <w:bottom w:w="0.0" w:type="dxa"/>
-        <w:right w:w="115.0" w:type="dxa"/>
-      </w:tblCellMar>
-    </w:tblPr>
-  </w:style>
-  <w:style w:type="table" w:styleId="Table6">
-    <w:basedOn w:val="TableNormal"/>
-    <w:tblPr>
-      <w:tblStyleRowBandSize w:val="1"/>
-      <w:tblStyleColBandSize w:val="1"/>
-      <w:tblCellMar>
-        <w:top w:w="0.0" w:type="dxa"/>
-        <w:left w:w="115.0" w:type="dxa"/>
-        <w:bottom w:w="0.0" w:type="dxa"/>
-        <w:right w:w="115.0" w:type="dxa"/>
-      </w:tblCellMar>
-    </w:tblPr>
-  </w:style>
-  <w:style w:type="paragraph" w:styleId="Subtitle">
-    <w:name w:val="Subtitle"/>
-    <w:basedOn w:val="Normal"/>
-    <w:next w:val="Normal"/>
-    <w:pPr>
-      <w:keepNext w:val="1"/>
-      <w:keepLines w:val="1"/>
-      <w:spacing w:after="80" w:before="360" w:lineRule="auto"/>
-    </w:pPr>
-    <w:rPr>
-      <w:rFonts w:ascii="Georgia" w:cs="Georgia" w:eastAsia="Georgia" w:hAnsi="Georgia"/>
-      <w:i w:val="1"/>
+      <w:iCs w:val="1"/>
       <w:color w:val="666666"/>
       <w:sz w:val="48"/>
       <w:szCs w:val="48"/>
@@ -6247,7 +6153,7 @@
 </file>
 
 <file path=word/theme/theme1.xml><?xml version="1.0" encoding="utf-8"?>
-<a:theme xmlns:a="http://schemas.openxmlformats.org/drawingml/2006/main" name="Tema de Office">
+<a:theme xmlns:a="http://schemas.openxmlformats.org/drawingml/2006/main" name="Office Theme">
   <a:themeElements>
     <a:clrScheme name="Office">
       <a:dk1>
@@ -6257,39 +6163,39 @@
         <a:sysClr val="window" lastClr="FFFFFF"/>
       </a:lt1>
       <a:dk2>
-        <a:srgbClr val="44546A"/>
+        <a:srgbClr val="1F497D"/>
       </a:dk2>
       <a:lt2>
-        <a:srgbClr val="E7E6E6"/>
+        <a:srgbClr val="EEECE1"/>
       </a:lt2>
       <a:accent1>
-        <a:srgbClr val="5B9BD5"/>
+        <a:srgbClr val="4F81BD"/>
       </a:accent1>
       <a:accent2>
-        <a:srgbClr val="ED7D31"/>
+        <a:srgbClr val="C0504D"/>
       </a:accent2>
       <a:accent3>
-        <a:srgbClr val="A5A5A5"/>
+        <a:srgbClr val="9BBB59"/>
       </a:accent3>
       <a:accent4>
-        <a:srgbClr val="FFC000"/>
+        <a:srgbClr val="8064A2"/>
       </a:accent4>
       <a:accent5>
-        <a:srgbClr val="4472C4"/>
+        <a:srgbClr val="4BACC6"/>
       </a:accent5>
       <a:accent6>
-        <a:srgbClr val="70AD47"/>
+        <a:srgbClr val="F79646"/>
       </a:accent6>
       <a:hlink>
-        <a:srgbClr val="0563C1"/>
+        <a:srgbClr val="0000FF"/>
       </a:hlink>
       <a:folHlink>
-        <a:srgbClr val="954F72"/>
+        <a:srgbClr val="800080"/>
       </a:folHlink>
     </a:clrScheme>
     <a:fontScheme name="Office">
       <a:majorFont>
-        <a:latin typeface="Calibri Light" panose="020F0302020204030204"/>
+        <a:latin typeface="Calibri"/>
         <a:ea typeface=""/>
         <a:cs typeface=""/>
         <a:font script="Jpan" typeface="ＭＳ ゴシック"/>
@@ -6324,7 +6230,7 @@
         <a:font script="Geor" typeface="Sylfaen"/>
       </a:majorFont>
       <a:minorFont>
-        <a:latin typeface="Calibri" panose="020F0502020204030204"/>
+        <a:latin typeface="Cambria"/>
         <a:ea typeface=""/>
         <a:cs typeface=""/>
         <a:font script="Jpan" typeface="ＭＳ 明朝"/>
@@ -6368,148 +6274,207 @@
           <a:gsLst>
             <a:gs pos="0">
               <a:schemeClr val="phClr">
-                <a:lumMod val="110000"/>
-                <a:satMod val="105000"/>
-                <a:tint val="67000"/>
+                <a:tint val="50000"/>
+                <a:satMod val="300000"/>
               </a:schemeClr>
             </a:gs>
-            <a:gs pos="50000">
+            <a:gs pos="35000">
               <a:schemeClr val="phClr">
-                <a:lumMod val="105000"/>
-                <a:satMod val="103000"/>
-                <a:tint val="73000"/>
+                <a:tint val="37000"/>
+                <a:satMod val="300000"/>
               </a:schemeClr>
             </a:gs>
             <a:gs pos="100000">
               <a:schemeClr val="phClr">
-                <a:lumMod val="105000"/>
-                <a:satMod val="109000"/>
-                <a:tint val="81000"/>
+                <a:tint val="15000"/>
+                <a:satMod val="350000"/>
               </a:schemeClr>
             </a:gs>
           </a:gsLst>
-          <a:lin ang="5400000" scaled="0"/>
+          <a:lin ang="16200000" scaled="1"/>
         </a:gradFill>
         <a:gradFill rotWithShape="1">
           <a:gsLst>
             <a:gs pos="0">
               <a:schemeClr val="phClr">
-                <a:satMod val="103000"/>
-                <a:lumMod val="102000"/>
-                <a:tint val="94000"/>
-              </a:schemeClr>
-            </a:gs>
-            <a:gs pos="50000">
-              <a:schemeClr val="phClr">
-                <a:satMod val="110000"/>
-                <a:lumMod val="100000"/>
+                <a:tint val="100000"/>
                 <a:shade val="100000"/>
+                <a:satMod val="130000"/>
               </a:schemeClr>
             </a:gs>
             <a:gs pos="100000">
               <a:schemeClr val="phClr">
-                <a:lumMod val="99000"/>
-                <a:satMod val="120000"/>
-                <a:shade val="78000"/>
+                <a:tint val="50000"/>
+                <a:shade val="100000"/>
+                <a:satMod val="350000"/>
               </a:schemeClr>
             </a:gs>
           </a:gsLst>
-          <a:lin ang="5400000" scaled="0"/>
+          <a:lin ang="16200000" scaled="0"/>
         </a:gradFill>
       </a:fillStyleLst>
       <a:lnStyleLst>
-        <a:ln w="6350" cap="flat" cmpd="sng" algn="ctr">
+        <a:ln w="9525" cap="flat" cmpd="sng" algn="ctr">
+          <a:solidFill>
+            <a:schemeClr val="phClr">
+              <a:shade val="95000"/>
+              <a:satMod val="105000"/>
+            </a:schemeClr>
+          </a:solidFill>
+          <a:prstDash val="solid"/>
+        </a:ln>
+        <a:ln w="25400" cap="flat" cmpd="sng" algn="ctr">
           <a:solidFill>
             <a:schemeClr val="phClr"/>
           </a:solidFill>
           <a:prstDash val="solid"/>
-          <a:miter lim="800000"/>
         </a:ln>
-        <a:ln w="12700" cap="flat" cmpd="sng" algn="ctr">
+        <a:ln w="38100" cap="flat" cmpd="sng" algn="ctr">
           <a:solidFill>
             <a:schemeClr val="phClr"/>
           </a:solidFill>
           <a:prstDash val="solid"/>
-          <a:miter lim="800000"/>
-        </a:ln>
-        <a:ln w="19050" cap="flat" cmpd="sng" algn="ctr">
-          <a:solidFill>
-            <a:schemeClr val="phClr"/>
-          </a:solidFill>
-          <a:prstDash val="solid"/>
-          <a:miter lim="800000"/>
         </a:ln>
       </a:lnStyleLst>
       <a:effectStyleLst>
         <a:effectStyle>
-          <a:effectLst/>
-        </a:effectStyle>
-        <a:effectStyle>
-          <a:effectLst/>
+          <a:effectLst>
+            <a:outerShdw blurRad="40000" dist="20000" dir="5400000" rotWithShape="0">
+              <a:srgbClr val="000000">
+                <a:alpha val="38000"/>
+              </a:srgbClr>
+            </a:outerShdw>
+          </a:effectLst>
         </a:effectStyle>
         <a:effectStyle>
           <a:effectLst>
-            <a:outerShdw blurRad="57150" dist="19050" dir="5400000" algn="ctr" rotWithShape="0">
+            <a:outerShdw blurRad="40000" dist="23000" dir="5400000" rotWithShape="0">
               <a:srgbClr val="000000">
-                <a:alpha val="63000"/>
+                <a:alpha val="35000"/>
               </a:srgbClr>
             </a:outerShdw>
           </a:effectLst>
+        </a:effectStyle>
+        <a:effectStyle>
+          <a:effectLst>
+            <a:outerShdw blurRad="40000" dist="23000" dir="5400000" rotWithShape="0">
+              <a:srgbClr val="000000">
+                <a:alpha val="35000"/>
+              </a:srgbClr>
+            </a:outerShdw>
+          </a:effectLst>
+          <a:scene3d>
+            <a:camera prst="orthographicFront">
+              <a:rot lat="0" lon="0" rev="0"/>
+            </a:camera>
+            <a:lightRig rig="threePt" dir="t">
+              <a:rot lat="0" lon="0" rev="1200000"/>
+            </a:lightRig>
+          </a:scene3d>
+          <a:sp3d>
+            <a:bevelT w="63500" h="25400"/>
+          </a:sp3d>
         </a:effectStyle>
       </a:effectStyleLst>
       <a:bgFillStyleLst>
         <a:solidFill>
           <a:schemeClr val="phClr"/>
         </a:solidFill>
-        <a:solidFill>
-          <a:schemeClr val="phClr">
-            <a:tint val="95000"/>
-            <a:satMod val="170000"/>
-          </a:schemeClr>
-        </a:solidFill>
         <a:gradFill rotWithShape="1">
           <a:gsLst>
             <a:gs pos="0">
               <a:schemeClr val="phClr">
-                <a:tint val="93000"/>
-                <a:satMod val="150000"/>
-                <a:shade val="98000"/>
-                <a:lumMod val="102000"/>
+                <a:tint val="40000"/>
+                <a:satMod val="350000"/>
               </a:schemeClr>
             </a:gs>
-            <a:gs pos="50000">
+            <a:gs pos="40000">
               <a:schemeClr val="phClr">
-                <a:tint val="98000"/>
-                <a:satMod val="130000"/>
-                <a:shade val="90000"/>
-                <a:lumMod val="103000"/>
+                <a:tint val="45000"/>
+                <a:shade val="99000"/>
+                <a:satMod val="350000"/>
               </a:schemeClr>
             </a:gs>
             <a:gs pos="100000">
               <a:schemeClr val="phClr">
-                <a:shade val="63000"/>
-                <a:satMod val="120000"/>
+                <a:shade val="20000"/>
+                <a:satMod val="255000"/>
               </a:schemeClr>
             </a:gs>
           </a:gsLst>
-          <a:lin ang="5400000" scaled="0"/>
+          <a:path path="circle">
+            <a:fillToRect l="50000" t="-80000" r="50000" b="180000"/>
+          </a:path>
+        </a:gradFill>
+        <a:gradFill rotWithShape="1">
+          <a:gsLst>
+            <a:gs pos="0">
+              <a:schemeClr val="phClr">
+                <a:tint val="80000"/>
+                <a:satMod val="300000"/>
+              </a:schemeClr>
+            </a:gs>
+            <a:gs pos="100000">
+              <a:schemeClr val="phClr">
+                <a:shade val="30000"/>
+                <a:satMod val="200000"/>
+              </a:schemeClr>
+            </a:gs>
+          </a:gsLst>
+          <a:path path="circle">
+            <a:fillToRect l="50000" t="50000" r="50000" b="50000"/>
+          </a:path>
         </a:gradFill>
       </a:bgFillStyleLst>
     </a:fmtScheme>
   </a:themeElements>
-  <a:objectDefaults/>
+  <a:objectDefaults>
+    <a:spDef>
+      <a:spPr/>
+      <a:bodyPr/>
+      <a:lstStyle/>
+      <a:style>
+        <a:lnRef idx="1">
+          <a:schemeClr val="accent1"/>
+        </a:lnRef>
+        <a:fillRef idx="3">
+          <a:schemeClr val="accent1"/>
+        </a:fillRef>
+        <a:effectRef idx="2">
+          <a:schemeClr val="accent1"/>
+        </a:effectRef>
+        <a:fontRef idx="minor">
+          <a:schemeClr val="lt1"/>
+        </a:fontRef>
+      </a:style>
+    </a:spDef>
+    <a:lnDef>
+      <a:spPr/>
+      <a:bodyPr/>
+      <a:lstStyle/>
+      <a:style>
+        <a:lnRef idx="2">
+          <a:schemeClr val="accent1"/>
+        </a:lnRef>
+        <a:fillRef idx="0">
+          <a:schemeClr val="accent1"/>
+        </a:fillRef>
+        <a:effectRef idx="1">
+          <a:schemeClr val="accent1"/>
+        </a:effectRef>
+        <a:fontRef idx="minor">
+          <a:schemeClr val="tx1"/>
+        </a:fontRef>
+      </a:style>
+    </a:lnDef>
+  </a:objectDefaults>
   <a:extraClrSchemeLst/>
-  <a:extLst>
-    <a:ext uri="{05A4C25C-085E-4340-85A3-A5531E510DB2}">
-      <thm15:themeFamily xmlns:thm15="http://schemas.microsoft.com/office/thememl/2012/main" name="Office Theme" id="{62F939B6-93AF-4DB8-9C6B-D6C7DFDC589F}" vid="{4A3C46E8-61CC-4603-A589-7422A47A8E4A}"/>
-    </a:ext>
-  </a:extLst>
 </a:theme>
 </file>
 
 <file path=customXML/item1.xml><?xml version="1.0" encoding="utf-8"?>
 <go:gDocsCustomXmlDataStorage xmlns:go="http://customooxmlschemas.google.com/" xmlns:r="http://schemas.openxmlformats.org/officeDocument/2006/relationships" uri="GoogleDocsCustomDataVersion2">
-  <go:docsCustomData xmlns:go="http://customooxmlschemas.google.com/" roundtripDataSignature="AMtx7miBJa0pkeknSsgOTknQImj20f4COA==">CgMxLjAyCGguZ2pkZ3hzMg5oLjF4eXZndmV4ZWM3bjIOaC5qNHhzaG9uZWZieXkyDmguZW1xMnFjYTczb3YzMg5oLjE1dHpjZTdod2Y5YTIOaC5wNjJ5OGxvZGdnenUyDmguaG15ZnZ2c3JheW02Mg5oLmI3OGpoeDlyM2c5czIOaC40M2JpcHc4ZnZtejkyDmguM2p3djlkbGVsdzF2Mg5oLjY2d3Z2eXhhNXpwbDIJaC4zMGowemxsOAByITFrdkNRREY1THlVSDlHamh4djV6SkdhYk9DVUt5SWt6Qw==</go:docsCustomData>
+  <go:docsCustomData xmlns:go="http://customooxmlschemas.google.com/" roundtripDataSignature="AMtx7mipdPkM/LaAyN4/HM7g30SDoFczCA==">CgMxLjAyCGguZ2pkZ3hzMg5oLmhrdHF1bTdtNjA1ZDIOaC5qNHhzaG9uZWZieXkyDmguZW1xMnFjYTczb3YzMg5oLjE1dHpjZTdod2Y5YTIOaC5wNjJ5OGxvZGdnenUyDmguaG15ZnZ2c3JheW02Mg5oLmhteWZ2dnNyYXltNjIOaC5iNzhqaHg5cjNnOXMyDmguNDNiaXB3OGZ2bXo5Mg5oLjNqd3Y5ZGxlbHcxdjIOaC42Nnd2dnl4YTV6cGwyCWguMzBqMHpsbDgAciExQmlmUi1rZ205ZjRwbTF5Z2pCNWJxOU1rcVo1Q2Z0dWk=</go:docsCustomData>
 </go:gDocsCustomXmlDataStorage>
 </file>
 

</xml_diff>